<commit_message>
Add new framework pipeline diagram and detailed novel contributions for multi-UAV coordination
</commit_message>
<xml_diff>
--- a/final-synopsis-after-a-lot-of-struggle/CUI_Synopsis_UPDATED.docx
+++ b/final-synopsis-after-a-lot-of-struggle/CUI_Synopsis_UPDATED.docx
@@ -4651,7 +4651,7 @@
           <w:b w:val="0"/>
           <w:sz w:val="24"/>
         </w:rPr>
-        <w:t>Multi-UAV coordination using deep reinforcement learning has advanced significantly, yet a structural and documented gap persists: target assignment and collision avoidance are not independent decisions, and no existing framework addresses the coupling between them. The two most advanced contributions to these sub-problems — DA-MAPPO (Sheng et al., 2026) for target assignment and IGAT-MARL (Rezaee et al., 2026) for collision avoidance — were developed independently, each tested in two-dimensional environments with at most ten drones, and each explicitly identifies the other paper's contribution as its own future work. DA-MAPPO demonstrated that embedding real-time Hungarian-algorithm-based target assignments into each drone's observation vector is the sole mechanism responsible for successful navigation: its own ablation study shows 0% mission success when this assignment information is removed. IGAT-MARL demonstrated that sparse conflict-aware interaction graphs, which connect only drone pairs on a predicted collision course, reduce unnecessary communication by 44% while improving avoidance performance. This research proposes a unified MAPPO-based framework that integrates both mechanisms in a single policy trained in a 3D simulation environment. The central research problem is the structural coupling between these two objectives: the path each drone takes toward its assigned target determines its proximity to other agents, while any collision-driven course deviation changes which assignment that drone can still complete. In three dimensions, where altitude introduces vertical collision courses absent from planar environments, this coupling creates coordination failures — a single evasive maneuver can cascade into reassignment conflicts across the swarm — that neither framework alone can resolve. The proposed framework encodes both assignment state and conflict neighborhood in each drone's observation, trained via curriculum learning from 3 to 8 drones with progressive obstacle density. Evaluation will compare against four controlled baselines across three swarm sizes and three obstacle densities, yielding the first empirical answer to whether joint encoding of both constraints enables a unified policy to maintain high-value target coverage and collision-free operation under dynamic conditions.</w:t>
+        <w:t>Multi-UAV coordination using deep reinforcement learning has advanced significantly, yet a structural and documented gap persists: target assignment and collision avoidance are not independent decisions, and no existing framework addresses the coupling between them. The two most advanced contributions to these sub-problems — DA-MAPPO (Sheng et al., 2026) for target assignment and IGAT-MARL (Rezaee et al., 2026) for collision avoidance — were developed independently, each tested in two-dimensional environments with at most ten drones, and each explicitly identifies the other paper's contribution as its own future work. DA-MAPPO demonstrated that embedding real-time Hungarian-algorithm-based target assignments into each drone's observation vector is the sole mechanism responsible for successful navigation: its own ablation study shows 0% mission success when this assignment information is removed. IGAT-MARL demonstrated that sparse conflict-aware interaction graphs, which connect only drone pairs on a predicted collision course, reduce unnecessary communication by 44% while improving avoidance performance. This research proposes a unified MAPPO-based framework that integrates both mechanisms in a single policy trained in a 3D simulation environment. The central research problem is the structural coupling between these two objectives: the path each drone takes toward its assigned target determines its proximity to other agents, while any collision-driven course deviation changes which assignment that drone can still complete. In three dimensions, where altitude introduces vertical collision courses absent from planar environments, this coupling creates coordination failures — a single evasive maneuver can cascade into reassignment conflicts across the swarm — that neither framework alone can resolve. The proposed framework encodes both assignment state and conflict neighborhood in each drone's observation, and introduces a Priority Arbitration Head — a lightweight feedforward module jointly trained with the MAPPO actor — that takes time-to-collision, distance to the assigned target, and conflict neighborhood count as inputs and outputs a dynamic weight α at each decision step, applied as: r_total = α × r_assignment + (1−α) × r_avoidance. Unlike DA-MAPPO and IGAT-MARL, which both apply fixed reward coefficients throughout training, the Priority Arbitration Head learns when evasion must override assignment and when assignment can safely dominate — making it the first mechanism to resolve the assignment–avoidance tension within a single coordinated decision. The framework is trained via curriculum learning from 3 to 8 drones with progressive obstacle density. Evaluation will compare the learned arbitration weight against fixed-coefficient baselines (α = 0.3, 0.5, 0.7) and prior frameworks across three swarm sizes and three obstacle densities, yielding the first empirical answer to whether a dynamically arbitrated policy outperforms fixed-weight approaches in maintaining both mission success and collision safety under three-dimensional dynamic conditions.</w:t>
       </w:r>
       <w:r>
         <w:rPr>
@@ -9376,7 +9376,7 @@
         <w:rPr>
           <w:b w:val="0"/>
         </w:rPr>
-        <w:t xml:space="preserve">In cooperative multi-UAV missions, target assignment and collision avoidance are structurally coupled rather than independent decisions: the route each drone takes toward its designated target directly determines how close it comes to other agents and obstacles, and any course correction made to avoid a collision changes which assignment that drone can realistically still complete. This coupling propagates through the swarm. When a single drone executes an evasive maneuver, its original high-priority target may go unattended; neighboring drones face immediate reassignment conflicts; and the trajectories they adjust in response introduce new inter-agent proximity risks — a chain in which one local deviation escalates into a mission-level coordination failure. The problem intensifies when target priorities shift mid-mission: a drone simultaneously committed to a prior assignment, displaced from the position optimal for a new one, and on a collision course with another agent faces two contradictions at once, with no mechanism in place to resolve them within a single coordinated decision. Without explicitly accounting for how task allocation shapes each drone's spatial behavior and how safety-driven deviations feed back into task feasibility, multi-UAV systems cannot reliably maintain both high-value target coverage and collision-free operation under dynamic conditions. Existing frameworks address only one side of this coupling: DA-MAPPO treats collision avoidance as a static penalty term, leaving conflict-driven course corrections invisible to its assignment logic, while IGAT-MARL assumes fixed targets, making the assignment consequences of any avoidance maneuver unrepresentable in the policy. </w:t>
+        <w:t>In cooperative multi-UAV missions, target assignment and collision avoidance are structurally coupled rather than independent decisions: the route each drone takes toward its designated target directly determines how close it comes to other agents and obstacles, and any course correction made to avoid a collision changes which assignment that drone can realistically still complete. This coupling propagates through the swarm. When a single drone executes an evasive maneuver, its original high-priority target may go unattended; neighboring drones face immediate reassignment conflicts; and the trajectories they adjust in response introduce new inter-agent proximity risks — a chain in which one local deviation escalates into a mission-level coordination failure. The problem intensifies when target priorities shift mid-mission: a drone simultaneously committed to a prior assignment, displaced from the position optimal for a new one, and on a collision course with another agent faces two contradictions at once, with no mechanism in place to resolve them within a single coordinated decision. Without explicitly accounting for how task allocation shapes each drone's spatial behavior and how safety-driven deviations feed back into task feasibility, multi-UAV systems cannot reliably maintain both high-value target coverage and collision-free operation under dynamic conditions. Existing frameworks address only one side of this coupling: DA-MAPPO treats collision avoidance as a static penalty term, leaving conflict-driven course corrections invisible to its assignment logic, while IGAT-MARL assumes fixed targets, making the assignment consequences of any avoidance maneuver unrepresentable in the policy. The result is a fundamental unresolved tension: no existing framework provides a joint representation in which both assignment state and conflict neighborhood are simultaneously visible to a single shared policy, and whether a unified architecture can hold both objectives in balance — or whether one systematically undermines the other — has not been established in three-dimensional multi-UAV environments. The proposed coordinated mechanism is a Priority Arbitration Head: a small neural network jointly trained with the MAPPO actor that takes time-to-collision, distance to the assigned target, and conflict neighborhood count as inputs and outputs a dynamic weight α ∈ [0,1] at each decision step, applied as: r_total = α × r_assignment + (1−α) × r_avoidance. Unlike the fixed reward coefficients used in DA-MAPPO and the fixed penalty constants used in IGAT-MARL, the arbitration head learns when evasion must override assignment and when assignment can safely dominate, providing within a single coordinated decision the mechanism that neither existing framework supplies.</w:t>
       </w:r>
       <w:r>
         <w:rPr>
@@ -9384,7 +9384,6 @@
           <w:b w:val="0"/>
           <w:sz w:val="24"/>
         </w:rPr>
-        <w:t>The result is a fundamental unresolved tension: no existing framework provides a joint representation in which both assignment state and conflict neighborhood are simultaneously visible to a single shared policy, and whether a unified architecture can hold both objectives in balance — or whether one systematically undermines the other — has not been established in three-dimensional multi-UAV environments.</w:t>
       </w:r>
     </w:p>
     <w:p>
@@ -9430,14 +9429,22 @@
       </w:pPr>
       <w:r>
         <w:rPr>
+          <w:bCs/>
+          <w:sz w:val="24"/>
+          <w:szCs w:val="24"/>
+        </w:rPr>
+        <w:t>To design and implement a Priority Arbitration Head — a lightweight feedforward module jointly trained with the MAPPO actor — that dynamically weights assignment and avoidance objectives at each decision step using time-to-collision, distance to the assigned target, and conflict neighborhood count as inputs, integrated within a unified observation framework that encodes both Hungarian-algorithm-based target assignment and conflict-graph-aware neighborhood for each drone in a three-dimensional environment.</w:t>
+      </w:r>
+      <w:proofErr w:type="spellStart"/>
+      <w:r>
+        <w:rPr>
           <w:rFonts w:asciiTheme="majorBidi" w:hAnsiTheme="majorBidi" w:cstheme="majorBidi"/>
           <w:bCs/>
           <w:sz w:val="24"/>
           <w:szCs w:val="24"/>
         </w:rPr>
-        <w:t xml:space="preserve">To design an integrated representation of the observation that encodes both the assignment (based on Hungarian algorithm) and the current conflict-aware neighborhood for each </w:t>
       </w:r>
-      <w:proofErr w:type="spellStart"/>
+      <w:proofErr w:type="spellEnd"/>
       <w:r>
         <w:rPr>
           <w:rFonts w:asciiTheme="majorBidi" w:hAnsiTheme="majorBidi" w:cstheme="majorBidi"/>
@@ -9445,17 +9452,6 @@
           <w:sz w:val="24"/>
           <w:szCs w:val="24"/>
         </w:rPr>
-        <w:t>drone</w:t>
-      </w:r>
-      <w:proofErr w:type="spellEnd"/>
-      <w:r>
-        <w:rPr>
-          <w:rFonts w:asciiTheme="majorBidi" w:hAnsiTheme="majorBidi" w:cstheme="majorBidi"/>
-          <w:bCs/>
-          <w:sz w:val="24"/>
-          <w:szCs w:val="24"/>
-        </w:rPr>
-        <w:t xml:space="preserve"> in a 3D MAPPO policy.</w:t>
       </w:r>
     </w:p>
     <w:p>
@@ -9502,12 +9498,11 @@
       </w:pPr>
       <w:r>
         <w:rPr>
-          <w:rFonts w:asciiTheme="majorBidi" w:hAnsiTheme="majorBidi" w:cstheme="majorBidi"/>
           <w:bCs/>
           <w:sz w:val="24"/>
           <w:szCs w:val="24"/>
         </w:rPr>
-        <w:t>To perform controlled ablation experiments, isolating the contribution of the conflict graph, the assignment mechanism, and the 3D extension, whether each of them increases or decreases the number of assignments, and whether they increase or decrease more together.</w:t>
+        <w:t>To perform controlled ablation experiments that isolate the contribution of each framework component — the conflict graph, the Hungarian assignment mechanism, the 3D environment extension, and the Priority Arbitration Head — with explicit comparison between the learned arbitration weight α and fixed-coefficient baselines at α = 0.3, 0.5, and 0.7, in order to determine whether a learned weighting mechanism outperforms fixed reward coefficients in maintaining both high mission success and low collision incidence under dynamic three-dimensional conditions.</w:t>
       </w:r>
     </w:p>
     <w:p>
@@ -9675,11 +9670,10 @@
       </w:pPr>
       <w:r>
         <w:rPr>
-          <w:rFonts w:asciiTheme="majorBidi" w:hAnsiTheme="majorBidi" w:cstheme="majorBidi"/>
           <w:sz w:val="24"/>
           <w:szCs w:val="24"/>
         </w:rPr>
-        <w:t>The observation vector for each drone includes four elements: (1) the 3D position and velocity of the drone; (2) the 3D relative position of the drone's current target, as computed from a minimum-cost Hungarian assignment performed over all drones at each decision step; (3) the positions and velocities of the drone's current conflict neighbors only; these neighbors are determined by a dynamic conflict graph established at each decision step, which connects sets of drone pairs expected to come within a certain time horizon of a danger threshold; and (4) obstacle proximity readings in six cardinal directions. Actions are 3D velocity instructions that are executed continuously over time, trained against a common MAPPO actor-critic network and centralized critic, and executed by a decentralized MAPPO actor network.</w:t>
+        <w:t>The observation vector for each drone includes four elements: (1) the 3D position and velocity of the drone; (2) the 3D relative position of the drone's current target, as computed from a minimum-cost Hungarian assignment performed over all drones at each decision step; (3) the positions and velocities of the drone's current conflict neighbors only; these neighbors are determined by a dynamic conflict graph established at each decision step, which connects sets of drone pairs expected to come within a certain time horizon of a danger threshold; and (4) obstacle proximity readings in six cardinal directions. Actions are 3D velocity instructions that are executed continuously over time, trained against a common MAPPO actor-critic network and centralized critic, and executed by a decentralized MAPPO actor network. The Priority Arbitration Head — a two-layer feedforward network with 64 neurons, jointly trained with the MAPPO actor through the same policy gradient update — takes three scalar inputs at each decision step: time-to-collision (τ_collision), distance to the assigned target (d_target), and the count of drones in the conflict neighborhood (n_conflict). It outputs a single dynamic weight α ∈ [0,1] applied as: r_total = α × r_assignment + (1−α) × r_avoidance. The arbitration head adds no parameters to the centralized critic and requires no separate training loop; its weights are updated jointly with the MAPPO actor at each gradient step. This design makes the Priority Arbitration Head the first learned mechanism in the multi-UAV coordination literature to resolve the assignment–avoidance trade-off dynamically at each decision step, replacing the fixed hand-tuned reward coefficients used in all existing frameworks.</w:t>
       </w:r>
     </w:p>
     <w:p>
@@ -9989,23 +9983,64 @@
       </w:pPr>
       <w:r>
         <w:rPr>
+          <w:b/>
+          <w:bCs/>
+          <w:sz w:val="24"/>
+          <w:szCs w:val="24"/>
+        </w:rPr>
+        <w:t>Framework Pipeline:</w:t>
+        <w:br/>
+        <w:br/>
+        <w:t>Step 1 — Observation Building (per drone, per timestep):</w:t>
+        <w:br/>
+        <w:t xml:space="preserve">  (a) Self-state: 3D position and velocity</w:t>
+        <w:br/>
+        <w:t xml:space="preserve">  (b) Assignment state: relative position of assigned target [via minimum-cost Hungarian allocation over all drones]</w:t>
+        <w:br/>
+        <w:t xml:space="preserve">  (c) Conflict neighborhood: positions and velocities of drones predicted to come within collision threshold [via dynamic conflict graph]</w:t>
+        <w:br/>
+        <w:t xml:space="preserve">  (d) Obstacle proximity: distance readings in 6 cardinal directions</w:t>
+        <w:br/>
+        <w:br/>
+        <w:t>Step 2 — Parallel Processing of Joint Observation:</w:t>
+        <w:br/>
+        <w:t xml:space="preserve">  (a) MAPPO Decentralized Actor → 3D velocity action</w:t>
+        <w:br/>
+        <w:t xml:space="preserve">  (b) Priority Arbitration Head → dynamic weight α ∈ [0,1]</w:t>
+        <w:br/>
+        <w:t xml:space="preserve">       · Input: τ_collision (time-to-collision), d_target (distance to assigned target), n_conflict (conflict neighbor count)</w:t>
+        <w:br/>
+        <w:t xml:space="preserve">       · Output: α (close to 1 = assignment dominant; close to 0 = avoidance dominant)</w:t>
+        <w:br/>
+        <w:br/>
+        <w:t>Step 3 — Reward Computation:</w:t>
+        <w:br/>
+        <w:t xml:space="preserve">  r_total = α × r_assignment + (1−α) × r_avoidance</w:t>
+        <w:br/>
+        <w:t xml:space="preserve">  [α is state-conditioned and learned — not a fixed constant]</w:t>
+        <w:br/>
+        <w:br/>
+        <w:t>Step 4 — Environment Execution:</w:t>
+        <w:br/>
+        <w:t xml:space="preserve">  3D velocity command applied → new state observed → next timestep begins</w:t>
+        <w:br/>
+        <w:br/>
+        <w:t>Step 5 — Centralized Training (MAPPO):</w:t>
+        <w:br/>
+        <w:t xml:space="preserve">  Centralized Critic receives full joint state of all drones</w:t>
+        <w:br/>
+        <w:t xml:space="preserve">  Policy gradient update trains BOTH the MAPPO Actor AND the Priority Arbitration Head jointly</w:t>
+        <w:br/>
+        <w:t xml:space="preserve">  Decentralized execution: each drone uses only its own observation at deployment</w:t>
+      </w:r>
+      <w:r>
+        <w:rPr>
           <w:rFonts w:asciiTheme="majorBidi" w:hAnsiTheme="majorBidi" w:cstheme="majorBidi"/>
           <w:b/>
           <w:bCs/>
           <w:sz w:val="24"/>
           <w:szCs w:val="24"/>
         </w:rPr>
-        <w:t>Framework Pipeline:</w:t>
-      </w:r>
-      <w:r>
-        <w:rPr>
-          <w:rFonts w:asciiTheme="majorBidi" w:hAnsiTheme="majorBidi" w:cstheme="majorBidi"/>
-          <w:b/>
-          <w:bCs/>
-          <w:sz w:val="24"/>
-          <w:szCs w:val="24"/>
-        </w:rPr>
-        <w:br/>
       </w:r>
       <w:r>
         <w:rPr>
@@ -10013,7 +10048,6 @@
           <w:sz w:val="24"/>
           <w:szCs w:val="24"/>
         </w:rPr>
-        <w:br/>
       </w:r>
       <w:r>
         <w:rPr>
@@ -10022,41 +10056,6 @@
           <w:sz w:val="24"/>
           <w:szCs w:val="24"/>
         </w:rPr>
-        <w:drawing>
-          <wp:inline distT="0" distB="0" distL="0" distR="0" wp14:anchorId="1F9EF093" wp14:editId="5F6D6547">
-            <wp:extent cx="3804745" cy="4896512"/>
-            <wp:effectExtent l="0" t="0" r="5715" b="5715"/>
-            <wp:docPr id="2070379057" name="Picture 1"/>
-            <wp:cNvGraphicFramePr>
-              <a:graphicFrameLocks xmlns:a="http://schemas.openxmlformats.org/drawingml/2006/main" noChangeAspect="1"/>
-            </wp:cNvGraphicFramePr>
-            <a:graphic xmlns:a="http://schemas.openxmlformats.org/drawingml/2006/main">
-              <a:graphicData uri="http://schemas.openxmlformats.org/drawingml/2006/picture">
-                <pic:pic xmlns:pic="http://schemas.openxmlformats.org/drawingml/2006/picture">
-                  <pic:nvPicPr>
-                    <pic:cNvPr id="2070379057" name="Picture 2070379057"/>
-                    <pic:cNvPicPr/>
-                  </pic:nvPicPr>
-                  <pic:blipFill>
-                    <a:blip r:embed="rId22"/>
-                    <a:stretch>
-                      <a:fillRect/>
-                    </a:stretch>
-                  </pic:blipFill>
-                  <pic:spPr>
-                    <a:xfrm>
-                      <a:off x="0" y="0"/>
-                      <a:ext cx="3804745" cy="4896512"/>
-                    </a:xfrm>
-                    <a:prstGeom prst="rect">
-                      <a:avLst/>
-                    </a:prstGeom>
-                  </pic:spPr>
-                </pic:pic>
-              </a:graphicData>
-            </a:graphic>
-          </wp:inline>
-        </w:drawing>
       </w:r>
     </w:p>
     <w:p>

</xml_diff>

<commit_message>
Add various documents and scripts for UAV coordination research
- Created new Word documents for problem statements and research proposals.
- Added Python script for generating a concrete research proposal in Word format.
- Introduced markdown file detailing the assignment oscillation problem in UAV coordination.
- Included multiple presentation files and related materials for formal presentations.
- Removed outdated presentation files to streamline project resources.
</commit_message>
<xml_diff>
--- a/final-synopsis-after-a-lot-of-struggle/CUI_Synopsis_UPDATED.docx
+++ b/final-synopsis-after-a-lot-of-struggle/CUI_Synopsis_UPDATED.docx
@@ -4,3044 +4,6 @@
   <w:body>
     <w:p>
       <w:pPr>
-        <w:spacing w:before="77"/>
-        <w:ind w:right="132"/>
-        <w:jc w:val="right"/>
-        <w:rPr>
-          <w:rFonts w:ascii="Arial"/>
-          <w:b/>
-          <w:sz w:val="20"/>
-        </w:rPr>
-      </w:pPr>
-      <w:r>
-        <w:rPr>
-          <w:noProof/>
-          <w:color w:val="000000" w:themeColor="text1"/>
-          <w:sz w:val="32"/>
-          <w:szCs w:val="32"/>
-        </w:rPr>
-        <w:drawing>
-          <wp:anchor distT="0" distB="0" distL="0" distR="0" simplePos="0" relativeHeight="251662336" behindDoc="0" locked="0" layoutInCell="1" allowOverlap="1" wp14:anchorId="2EE9A420" wp14:editId="2DB3F4FF">
-            <wp:simplePos x="0" y="0"/>
-            <wp:positionH relativeFrom="page">
-              <wp:posOffset>914400</wp:posOffset>
-            </wp:positionH>
-            <wp:positionV relativeFrom="paragraph">
-              <wp:posOffset>313690</wp:posOffset>
-            </wp:positionV>
-            <wp:extent cx="775969" cy="742238"/>
-            <wp:effectExtent l="0" t="0" r="0" b="0"/>
-            <wp:wrapNone/>
-            <wp:docPr id="815007909" name="Image 1"/>
-            <wp:cNvGraphicFramePr>
-              <a:graphicFrameLocks xmlns:a="http://schemas.openxmlformats.org/drawingml/2006/main"/>
-            </wp:cNvGraphicFramePr>
-            <a:graphic xmlns:a="http://schemas.openxmlformats.org/drawingml/2006/main">
-              <a:graphicData uri="http://schemas.openxmlformats.org/drawingml/2006/picture">
-                <pic:pic xmlns:pic="http://schemas.openxmlformats.org/drawingml/2006/picture">
-                  <pic:nvPicPr>
-                    <pic:cNvPr id="1" name="Image 1"/>
-                    <pic:cNvPicPr/>
-                  </pic:nvPicPr>
-                  <pic:blipFill>
-                    <a:blip r:embed="rId8" cstate="print"/>
-                    <a:stretch>
-                      <a:fillRect/>
-                    </a:stretch>
-                  </pic:blipFill>
-                  <pic:spPr>
-                    <a:xfrm>
-                      <a:off x="0" y="0"/>
-                      <a:ext cx="775969" cy="742238"/>
-                    </a:xfrm>
-                    <a:prstGeom prst="rect">
-                      <a:avLst/>
-                    </a:prstGeom>
-                  </pic:spPr>
-                </pic:pic>
-              </a:graphicData>
-            </a:graphic>
-          </wp:anchor>
-        </w:drawing>
-      </w:r>
-      <w:r>
-        <w:rPr>
-          <w:rFonts w:ascii="Arial"/>
-          <w:b/>
-          <w:sz w:val="20"/>
-        </w:rPr>
-        <w:t>FORM:</w:t>
-      </w:r>
-      <w:r>
-        <w:rPr>
-          <w:rFonts w:ascii="Arial"/>
-          <w:b/>
-          <w:spacing w:val="-15"/>
-          <w:sz w:val="20"/>
-        </w:rPr>
-        <w:t xml:space="preserve"> </w:t>
-      </w:r>
-      <w:r>
-        <w:rPr>
-          <w:rFonts w:ascii="Arial"/>
-          <w:b/>
-          <w:sz w:val="20"/>
-        </w:rPr>
-        <w:t>GS-05</w:t>
-      </w:r>
-      <w:r>
-        <w:rPr>
-          <w:rFonts w:ascii="Arial"/>
-          <w:b/>
-          <w:spacing w:val="-10"/>
-          <w:sz w:val="20"/>
-        </w:rPr>
-        <w:t xml:space="preserve"> </w:t>
-      </w:r>
-      <w:r>
-        <w:rPr>
-          <w:rFonts w:ascii="Arial"/>
-          <w:b/>
-          <w:spacing w:val="-4"/>
-          <w:sz w:val="20"/>
-        </w:rPr>
-        <w:t>(v1)</w:t>
-      </w:r>
-    </w:p>
-    <w:p>
-      <w:pPr>
-        <w:pStyle w:val="Heading1"/>
-        <w:jc w:val="center"/>
-        <w:rPr>
-          <w:color w:val="000000" w:themeColor="text1"/>
-          <w:sz w:val="32"/>
-          <w:szCs w:val="32"/>
-        </w:rPr>
-      </w:pPr>
-      <w:bookmarkStart w:id="0" w:name="COMSATS_University_Islamabad"/>
-      <w:bookmarkEnd w:id="0"/>
-      <w:r>
-        <w:rPr>
-          <w:color w:val="000000" w:themeColor="text1"/>
-          <w:spacing w:val="-10"/>
-          <w:sz w:val="32"/>
-          <w:szCs w:val="32"/>
-        </w:rPr>
-        <w:t>COMSATS</w:t>
-      </w:r>
-      <w:r>
-        <w:rPr>
-          <w:color w:val="000000" w:themeColor="text1"/>
-          <w:spacing w:val="-6"/>
-          <w:sz w:val="32"/>
-          <w:szCs w:val="32"/>
-        </w:rPr>
-        <w:t xml:space="preserve"> </w:t>
-      </w:r>
-      <w:r>
-        <w:rPr>
-          <w:color w:val="000000" w:themeColor="text1"/>
-          <w:spacing w:val="-10"/>
-          <w:sz w:val="32"/>
-          <w:szCs w:val="32"/>
-        </w:rPr>
-        <w:t>University</w:t>
-      </w:r>
-      <w:r>
-        <w:rPr>
-          <w:color w:val="000000" w:themeColor="text1"/>
-          <w:spacing w:val="-11"/>
-          <w:sz w:val="32"/>
-          <w:szCs w:val="32"/>
-        </w:rPr>
-        <w:t xml:space="preserve"> </w:t>
-      </w:r>
-      <w:r>
-        <w:rPr>
-          <w:color w:val="000000" w:themeColor="text1"/>
-          <w:spacing w:val="-10"/>
-          <w:sz w:val="32"/>
-          <w:szCs w:val="32"/>
-        </w:rPr>
-        <w:t>Islamabad</w:t>
-      </w:r>
-    </w:p>
-    <w:p>
-      <w:pPr>
-        <w:pStyle w:val="BodyText"/>
-        <w:ind w:right="92"/>
-        <w:jc w:val="center"/>
-      </w:pPr>
-      <w:r>
-        <w:t>Appointment</w:t>
-      </w:r>
-      <w:r>
-        <w:rPr>
-          <w:spacing w:val="-15"/>
-        </w:rPr>
-        <w:t xml:space="preserve"> </w:t>
-      </w:r>
-      <w:r>
-        <w:t>of</w:t>
-      </w:r>
-      <w:r>
-        <w:rPr>
-          <w:spacing w:val="-17"/>
-        </w:rPr>
-        <w:t xml:space="preserve"> </w:t>
-      </w:r>
-      <w:r>
-        <w:t>Supervisor</w:t>
-      </w:r>
-      <w:r>
-        <w:rPr>
-          <w:spacing w:val="-11"/>
-        </w:rPr>
-        <w:t xml:space="preserve"> </w:t>
-      </w:r>
-      <w:r>
-        <w:t>and</w:t>
-      </w:r>
-      <w:r>
-        <w:rPr>
-          <w:spacing w:val="-11"/>
-        </w:rPr>
-        <w:t xml:space="preserve"> </w:t>
-      </w:r>
-      <w:r>
-        <w:t>Supervisory</w:t>
-      </w:r>
-      <w:r>
-        <w:rPr>
-          <w:spacing w:val="-14"/>
-        </w:rPr>
-        <w:t xml:space="preserve"> </w:t>
-      </w:r>
-      <w:r>
-        <w:rPr>
-          <w:spacing w:val="-2"/>
-        </w:rPr>
-        <w:t>Committee</w:t>
-      </w:r>
-    </w:p>
-    <w:p>
-      <w:pPr>
-        <w:pStyle w:val="BodyText"/>
-        <w:spacing w:before="2"/>
-        <w:ind w:right="349"/>
-        <w:jc w:val="center"/>
-        <w:rPr>
-          <w:rFonts w:ascii="Segoe UI Symbol" w:hAnsi="Segoe UI Symbol"/>
-        </w:rPr>
-      </w:pPr>
-      <w:r>
-        <w:t>MS</w:t>
-      </w:r>
-      <w:r>
-        <w:rPr>
-          <w:spacing w:val="-2"/>
-        </w:rPr>
-        <w:t xml:space="preserve"> </w:t>
-      </w:r>
-      <w:r>
-        <w:rPr>
-          <w:rFonts w:ascii="Segoe UI Symbol" w:hAnsi="Segoe UI Symbol"/>
-        </w:rPr>
-        <w:t>✔</w:t>
-      </w:r>
-      <w:r>
-        <w:rPr>
-          <w:rFonts w:ascii="Segoe UI Symbol" w:hAnsi="Segoe UI Symbol"/>
-          <w:spacing w:val="-19"/>
-        </w:rPr>
-        <w:t xml:space="preserve"> </w:t>
-      </w:r>
-      <w:r>
-        <w:rPr>
-          <w:spacing w:val="-2"/>
-        </w:rPr>
-        <w:t>Ph.D.</w:t>
-      </w:r>
-      <w:r>
-        <w:rPr>
-          <w:rFonts w:ascii="Segoe UI Symbol" w:hAnsi="Segoe UI Symbol"/>
-          <w:spacing w:val="-2"/>
-        </w:rPr>
-        <w:t>☐</w:t>
-      </w:r>
-    </w:p>
-    <w:p>
-      <w:pPr>
-        <w:spacing w:before="253"/>
-        <w:ind w:left="720"/>
-        <w:rPr>
-          <w:b/>
-        </w:rPr>
-      </w:pPr>
-      <w:r>
-        <w:rPr>
-          <w:b/>
-        </w:rPr>
-        <w:t>Student’s</w:t>
-      </w:r>
-      <w:r>
-        <w:rPr>
-          <w:b/>
-          <w:spacing w:val="-13"/>
-        </w:rPr>
-        <w:t xml:space="preserve"> </w:t>
-      </w:r>
-      <w:r>
-        <w:rPr>
-          <w:b/>
-          <w:spacing w:val="-2"/>
-        </w:rPr>
-        <w:t>Detail:</w:t>
-      </w:r>
-    </w:p>
-    <w:tbl>
-      <w:tblPr>
-        <w:tblW w:w="0" w:type="auto"/>
-        <w:tblInd w:w="816" w:type="dxa"/>
-        <w:tblBorders>
-          <w:top w:val="single" w:sz="4" w:space="0" w:color="000000"/>
-          <w:left w:val="single" w:sz="4" w:space="0" w:color="000000"/>
-          <w:bottom w:val="single" w:sz="4" w:space="0" w:color="000000"/>
-          <w:right w:val="single" w:sz="4" w:space="0" w:color="000000"/>
-          <w:insideH w:val="single" w:sz="4" w:space="0" w:color="000000"/>
-          <w:insideV w:val="single" w:sz="4" w:space="0" w:color="000000"/>
-        </w:tblBorders>
-        <w:tblLayout w:type="fixed"/>
-        <w:tblCellMar>
-          <w:left w:w="0" w:type="dxa"/>
-          <w:right w:w="0" w:type="dxa"/>
-        </w:tblCellMar>
-        <w:tblLook w:val="01E0" w:firstRow="1" w:lastRow="1" w:firstColumn="1" w:lastColumn="1" w:noHBand="0" w:noVBand="0"/>
-      </w:tblPr>
-      <w:tblGrid>
-        <w:gridCol w:w="5157"/>
-        <w:gridCol w:w="4384"/>
-      </w:tblGrid>
-      <w:tr>
-        <w:trPr>
-          <w:trHeight w:val="422"/>
-        </w:trPr>
-        <w:tc>
-          <w:tcPr>
-            <w:tcW w:w="5157" w:type="dxa"/>
-          </w:tcPr>
-          <w:p>
-            <w:pPr>
-              <w:pStyle w:val="TableParagraph"/>
-              <w:spacing w:before="116"/>
-              <w:ind w:left="110"/>
-            </w:pPr>
-            <w:r>
-              <w:t>Student’s</w:t>
-            </w:r>
-            <w:r>
-              <w:rPr>
-                <w:spacing w:val="-14"/>
-              </w:rPr>
-              <w:t xml:space="preserve"> </w:t>
-            </w:r>
-            <w:r>
-              <w:t>Name:</w:t>
-            </w:r>
-            <w:r>
-              <w:rPr>
-                <w:spacing w:val="-14"/>
-              </w:rPr>
-              <w:t xml:space="preserve"> </w:t>
-            </w:r>
-            <w:r>
-              <w:t>Ayesha</w:t>
-            </w:r>
-            <w:r>
-              <w:rPr>
-                <w:spacing w:val="-11"/>
-              </w:rPr>
-              <w:t xml:space="preserve"> </w:t>
-            </w:r>
-            <w:r>
-              <w:rPr>
-                <w:spacing w:val="-2"/>
-              </w:rPr>
-              <w:t>Khalil</w:t>
-            </w:r>
-          </w:p>
-        </w:tc>
-        <w:tc>
-          <w:tcPr>
-            <w:tcW w:w="4384" w:type="dxa"/>
-          </w:tcPr>
-          <w:p>
-            <w:pPr>
-              <w:pStyle w:val="TableParagraph"/>
-              <w:spacing w:before="116"/>
-              <w:ind w:left="110"/>
-            </w:pPr>
-            <w:r>
-              <w:rPr>
-                <w:spacing w:val="-6"/>
-              </w:rPr>
-              <w:t>Registration</w:t>
-            </w:r>
-            <w:r>
-              <w:rPr>
-                <w:spacing w:val="6"/>
-              </w:rPr>
-              <w:t xml:space="preserve"> </w:t>
-            </w:r>
-            <w:r>
-              <w:rPr>
-                <w:spacing w:val="-6"/>
-              </w:rPr>
-              <w:t>#</w:t>
-            </w:r>
-            <w:r>
-              <w:rPr>
-                <w:spacing w:val="-5"/>
-              </w:rPr>
-              <w:t xml:space="preserve"> CIIT/</w:t>
-            </w:r>
-            <w:r>
-              <w:rPr>
-                <w:spacing w:val="-6"/>
-              </w:rPr>
-              <w:t>SP25-RCS-009/ATD</w:t>
-            </w:r>
-          </w:p>
-        </w:tc>
-      </w:tr>
-      <w:tr>
-        <w:trPr>
-          <w:trHeight w:val="422"/>
-        </w:trPr>
-        <w:tc>
-          <w:tcPr>
-            <w:tcW w:w="5157" w:type="dxa"/>
-          </w:tcPr>
-          <w:p>
-            <w:pPr>
-              <w:pStyle w:val="TableParagraph"/>
-              <w:spacing w:before="116"/>
-              <w:ind w:left="110"/>
-            </w:pPr>
-            <w:r>
-              <w:rPr>
-                <w:spacing w:val="-2"/>
-              </w:rPr>
-              <w:t>Program:</w:t>
-            </w:r>
-            <w:r>
-              <w:rPr>
-                <w:spacing w:val="-10"/>
-              </w:rPr>
-              <w:t xml:space="preserve"> </w:t>
-            </w:r>
-            <w:r>
-              <w:rPr>
-                <w:spacing w:val="-2"/>
-              </w:rPr>
-              <w:t>RCS</w:t>
-            </w:r>
-          </w:p>
-        </w:tc>
-        <w:tc>
-          <w:tcPr>
-            <w:tcW w:w="4384" w:type="dxa"/>
-          </w:tcPr>
-          <w:p>
-            <w:pPr>
-              <w:pStyle w:val="TableParagraph"/>
-              <w:spacing w:before="116"/>
-              <w:ind w:left="110"/>
-            </w:pPr>
-            <w:r>
-              <w:rPr>
-                <w:spacing w:val="-2"/>
-              </w:rPr>
-              <w:t>Department:</w:t>
-            </w:r>
-            <w:r>
-              <w:rPr>
-                <w:spacing w:val="-9"/>
-              </w:rPr>
-              <w:t xml:space="preserve"> </w:t>
-            </w:r>
-            <w:r>
-              <w:rPr>
-                <w:spacing w:val="-2"/>
-              </w:rPr>
-              <w:t>Computer</w:t>
-            </w:r>
-            <w:r>
-              <w:rPr>
-                <w:spacing w:val="-8"/>
-              </w:rPr>
-              <w:t xml:space="preserve"> </w:t>
-            </w:r>
-            <w:r>
-              <w:rPr>
-                <w:spacing w:val="-2"/>
-              </w:rPr>
-              <w:t>Science</w:t>
-            </w:r>
-          </w:p>
-        </w:tc>
-      </w:tr>
-      <w:tr>
-        <w:trPr>
-          <w:trHeight w:val="422"/>
-        </w:trPr>
-        <w:tc>
-          <w:tcPr>
-            <w:tcW w:w="5157" w:type="dxa"/>
-          </w:tcPr>
-          <w:p>
-            <w:pPr>
-              <w:pStyle w:val="TableParagraph"/>
-              <w:spacing w:before="116"/>
-              <w:ind w:left="110"/>
-            </w:pPr>
-            <w:r>
-              <w:rPr>
-                <w:spacing w:val="-2"/>
-              </w:rPr>
-              <w:t>Campus: Abbottabad</w:t>
-            </w:r>
-          </w:p>
-        </w:tc>
-        <w:tc>
-          <w:tcPr>
-            <w:tcW w:w="4384" w:type="dxa"/>
-          </w:tcPr>
-          <w:p>
-            <w:pPr>
-              <w:pStyle w:val="TableParagraph"/>
-              <w:spacing w:before="116"/>
-              <w:ind w:left="110"/>
-            </w:pPr>
-            <w:r>
-              <w:t>Date</w:t>
-            </w:r>
-            <w:r>
-              <w:rPr>
-                <w:spacing w:val="-14"/>
-              </w:rPr>
-              <w:t xml:space="preserve"> </w:t>
-            </w:r>
-            <w:r>
-              <w:t>of</w:t>
-            </w:r>
-            <w:r>
-              <w:rPr>
-                <w:spacing w:val="-9"/>
-              </w:rPr>
-              <w:t xml:space="preserve"> </w:t>
-            </w:r>
-            <w:r>
-              <w:t>application:</w:t>
-            </w:r>
-            <w:r>
-              <w:rPr>
-                <w:spacing w:val="-10"/>
-              </w:rPr>
-              <w:t xml:space="preserve"> </w:t>
-            </w:r>
-            <w:r>
-              <w:t>2026-06-08</w:t>
-            </w:r>
-          </w:p>
-        </w:tc>
-      </w:tr>
-    </w:tbl>
-    <w:p>
-      <w:pPr>
-        <w:spacing w:before="250"/>
-        <w:ind w:left="720"/>
-        <w:rPr>
-          <w:b/>
-        </w:rPr>
-      </w:pPr>
-      <w:r>
-        <w:rPr>
-          <w:b/>
-          <w:spacing w:val="-2"/>
-        </w:rPr>
-        <w:t>Supervisory</w:t>
-      </w:r>
-      <w:r>
-        <w:rPr>
-          <w:b/>
-          <w:spacing w:val="8"/>
-        </w:rPr>
-        <w:t xml:space="preserve"> </w:t>
-      </w:r>
-      <w:r>
-        <w:rPr>
-          <w:b/>
-          <w:spacing w:val="-2"/>
-        </w:rPr>
-        <w:t>Committee:</w:t>
-      </w:r>
-    </w:p>
-    <w:tbl>
-      <w:tblPr>
-        <w:tblW w:w="0" w:type="auto"/>
-        <w:tblInd w:w="836" w:type="dxa"/>
-        <w:tblBorders>
-          <w:top w:val="single" w:sz="4" w:space="0" w:color="000000"/>
-          <w:left w:val="single" w:sz="4" w:space="0" w:color="000000"/>
-          <w:bottom w:val="single" w:sz="4" w:space="0" w:color="000000"/>
-          <w:right w:val="single" w:sz="4" w:space="0" w:color="000000"/>
-          <w:insideH w:val="single" w:sz="4" w:space="0" w:color="000000"/>
-          <w:insideV w:val="single" w:sz="4" w:space="0" w:color="000000"/>
-        </w:tblBorders>
-        <w:tblLayout w:type="fixed"/>
-        <w:tblCellMar>
-          <w:left w:w="0" w:type="dxa"/>
-          <w:right w:w="0" w:type="dxa"/>
-        </w:tblCellMar>
-        <w:tblLook w:val="01E0" w:firstRow="1" w:lastRow="1" w:firstColumn="1" w:lastColumn="1" w:noHBand="0" w:noVBand="0"/>
-      </w:tblPr>
-      <w:tblGrid>
-        <w:gridCol w:w="519"/>
-        <w:gridCol w:w="2766"/>
-        <w:gridCol w:w="1916"/>
-        <w:gridCol w:w="2253"/>
-        <w:gridCol w:w="2157"/>
-      </w:tblGrid>
-      <w:tr>
-        <w:trPr>
-          <w:trHeight w:val="618"/>
-        </w:trPr>
-        <w:tc>
-          <w:tcPr>
-            <w:tcW w:w="519" w:type="dxa"/>
-          </w:tcPr>
-          <w:p>
-            <w:pPr>
-              <w:pStyle w:val="TableParagraph"/>
-              <w:spacing w:line="249" w:lineRule="exact"/>
-              <w:ind w:left="23" w:right="72"/>
-              <w:jc w:val="center"/>
-              <w:rPr>
-                <w:b/>
-              </w:rPr>
-            </w:pPr>
-            <w:r>
-              <w:rPr>
-                <w:b/>
-                <w:spacing w:val="-5"/>
-              </w:rPr>
-              <w:t>S#</w:t>
-            </w:r>
-          </w:p>
-        </w:tc>
-        <w:tc>
-          <w:tcPr>
-            <w:tcW w:w="2766" w:type="dxa"/>
-          </w:tcPr>
-          <w:p>
-            <w:pPr>
-              <w:pStyle w:val="TableParagraph"/>
-              <w:spacing w:line="249" w:lineRule="exact"/>
-              <w:ind w:left="15"/>
-              <w:jc w:val="center"/>
-              <w:rPr>
-                <w:b/>
-              </w:rPr>
-            </w:pPr>
-            <w:r>
-              <w:rPr>
-                <w:b/>
-                <w:spacing w:val="-4"/>
-              </w:rPr>
-              <w:t>Name</w:t>
-            </w:r>
-          </w:p>
-        </w:tc>
-        <w:tc>
-          <w:tcPr>
-            <w:tcW w:w="1916" w:type="dxa"/>
-          </w:tcPr>
-          <w:p>
-            <w:pPr>
-              <w:pStyle w:val="TableParagraph"/>
-              <w:spacing w:line="247" w:lineRule="exact"/>
-              <w:ind w:left="29" w:right="9"/>
-              <w:jc w:val="center"/>
-              <w:rPr>
-                <w:b/>
-              </w:rPr>
-            </w:pPr>
-            <w:r>
-              <w:rPr>
-                <w:b/>
-                <w:spacing w:val="-2"/>
-              </w:rPr>
-              <w:t>Designation</w:t>
-            </w:r>
-          </w:p>
-          <w:p>
-            <w:pPr>
-              <w:pStyle w:val="TableParagraph"/>
-              <w:spacing w:line="182" w:lineRule="exact"/>
-              <w:ind w:left="29"/>
-              <w:jc w:val="center"/>
-              <w:rPr>
-                <w:sz w:val="16"/>
-              </w:rPr>
-            </w:pPr>
-            <w:r>
-              <w:rPr>
-                <w:sz w:val="16"/>
-              </w:rPr>
-              <w:t>(Also</w:t>
-            </w:r>
-            <w:r>
-              <w:rPr>
-                <w:spacing w:val="-10"/>
-                <w:sz w:val="16"/>
-              </w:rPr>
-              <w:t xml:space="preserve"> </w:t>
-            </w:r>
-            <w:r>
-              <w:rPr>
-                <w:sz w:val="16"/>
-              </w:rPr>
-              <w:t>specify</w:t>
-            </w:r>
-            <w:r>
-              <w:rPr>
-                <w:spacing w:val="-13"/>
-                <w:sz w:val="16"/>
-              </w:rPr>
-              <w:t xml:space="preserve"> </w:t>
-            </w:r>
-            <w:r>
-              <w:rPr>
-                <w:sz w:val="16"/>
-              </w:rPr>
-              <w:t>institution</w:t>
-            </w:r>
-            <w:r>
-              <w:rPr>
-                <w:spacing w:val="-13"/>
-                <w:sz w:val="16"/>
-              </w:rPr>
-              <w:t xml:space="preserve"> </w:t>
-            </w:r>
-            <w:r>
-              <w:rPr>
-                <w:sz w:val="16"/>
-              </w:rPr>
-              <w:t>if</w:t>
-            </w:r>
-            <w:r>
-              <w:rPr>
-                <w:spacing w:val="40"/>
-                <w:sz w:val="16"/>
-              </w:rPr>
-              <w:t xml:space="preserve"> </w:t>
-            </w:r>
-            <w:r>
-              <w:rPr>
-                <w:sz w:val="16"/>
-              </w:rPr>
-              <w:t>other than CUI)</w:t>
-            </w:r>
-          </w:p>
-        </w:tc>
-        <w:tc>
-          <w:tcPr>
-            <w:tcW w:w="2253" w:type="dxa"/>
-          </w:tcPr>
-          <w:p>
-            <w:pPr>
-              <w:pStyle w:val="TableParagraph"/>
-              <w:spacing w:line="247" w:lineRule="exact"/>
-              <w:ind w:left="12" w:right="8"/>
-              <w:jc w:val="center"/>
-              <w:rPr>
-                <w:b/>
-              </w:rPr>
-            </w:pPr>
-            <w:r>
-              <w:rPr>
-                <w:b/>
-                <w:spacing w:val="-4"/>
-              </w:rPr>
-              <w:t>Role</w:t>
-            </w:r>
-          </w:p>
-          <w:p>
-            <w:pPr>
-              <w:pStyle w:val="TableParagraph"/>
-              <w:spacing w:line="182" w:lineRule="exact"/>
-              <w:ind w:left="12"/>
-              <w:jc w:val="center"/>
-              <w:rPr>
-                <w:sz w:val="16"/>
-              </w:rPr>
-            </w:pPr>
-            <w:r>
-              <w:rPr>
-                <w:spacing w:val="-2"/>
-                <w:sz w:val="16"/>
-              </w:rPr>
-              <w:t>(Supervisor, co-supervisor or</w:t>
-            </w:r>
-            <w:r>
-              <w:rPr>
-                <w:spacing w:val="40"/>
-                <w:sz w:val="16"/>
-              </w:rPr>
-              <w:t xml:space="preserve"> </w:t>
-            </w:r>
-            <w:r>
-              <w:rPr>
-                <w:spacing w:val="-2"/>
-                <w:sz w:val="16"/>
-              </w:rPr>
-              <w:t>member)</w:t>
-            </w:r>
-          </w:p>
-        </w:tc>
-        <w:tc>
-          <w:tcPr>
-            <w:tcW w:w="2157" w:type="dxa"/>
-          </w:tcPr>
-          <w:p>
-            <w:pPr>
-              <w:pStyle w:val="TableParagraph"/>
-              <w:spacing w:line="249" w:lineRule="exact"/>
-              <w:ind w:left="622"/>
-              <w:rPr>
-                <w:b/>
-              </w:rPr>
-            </w:pPr>
-            <w:r>
-              <w:rPr>
-                <w:b/>
-                <w:noProof/>
-              </w:rPr>
-              <mc:AlternateContent>
-                <mc:Choice Requires="wpg">
-                  <w:drawing>
-                    <wp:anchor distT="0" distB="0" distL="0" distR="0" simplePos="0" relativeHeight="251665408" behindDoc="1" locked="0" layoutInCell="1" allowOverlap="1" wp14:anchorId="39EB112F" wp14:editId="09FF1B5C">
-                      <wp:simplePos x="0" y="0"/>
-                      <wp:positionH relativeFrom="column">
-                        <wp:posOffset>-44488</wp:posOffset>
-                      </wp:positionH>
-                      <wp:positionV relativeFrom="paragraph">
-                        <wp:posOffset>394711</wp:posOffset>
-                      </wp:positionV>
-                      <wp:extent cx="1191895" cy="1379855"/>
-                      <wp:effectExtent l="0" t="0" r="0" b="0"/>
-                      <wp:wrapNone/>
-                      <wp:docPr id="2" name="Group 2"/>
-                      <wp:cNvGraphicFramePr>
-                        <a:graphicFrameLocks xmlns:a="http://schemas.openxmlformats.org/drawingml/2006/main"/>
-                      </wp:cNvGraphicFramePr>
-                      <a:graphic xmlns:a="http://schemas.openxmlformats.org/drawingml/2006/main">
-                        <a:graphicData uri="http://schemas.microsoft.com/office/word/2010/wordprocessingGroup">
-                          <wpg:wgp>
-                            <wpg:cNvGrpSpPr>
-                              <a:grpSpLocks/>
-                            </wpg:cNvGrpSpPr>
-                            <wpg:grpSpPr>
-                              <a:xfrm>
-                                <a:off x="0" y="0"/>
-                                <a:ext cx="1191895" cy="1379855"/>
-                                <a:chOff x="0" y="0"/>
-                                <a:chExt cx="1191895" cy="1379855"/>
-                              </a:xfrm>
-                            </wpg:grpSpPr>
-                            <pic:pic xmlns:pic="http://schemas.openxmlformats.org/drawingml/2006/picture">
-                              <pic:nvPicPr>
-                                <pic:cNvPr id="3" name="Image 3"/>
-                                <pic:cNvPicPr/>
-                              </pic:nvPicPr>
-                              <pic:blipFill>
-                                <a:blip r:embed="rId9" cstate="print"/>
-                                <a:stretch>
-                                  <a:fillRect/>
-                                </a:stretch>
-                              </pic:blipFill>
-                              <pic:spPr>
-                                <a:xfrm>
-                                  <a:off x="0" y="576952"/>
-                                  <a:ext cx="753681" cy="431952"/>
-                                </a:xfrm>
-                                <a:prstGeom prst="rect">
-                                  <a:avLst/>
-                                </a:prstGeom>
-                              </pic:spPr>
-                            </pic:pic>
-                            <pic:pic xmlns:pic="http://schemas.openxmlformats.org/drawingml/2006/picture">
-                              <pic:nvPicPr>
-                                <pic:cNvPr id="4" name="Image 4"/>
-                                <pic:cNvPicPr/>
-                              </pic:nvPicPr>
-                              <pic:blipFill>
-                                <a:blip r:embed="rId10" cstate="print"/>
-                                <a:stretch>
-                                  <a:fillRect/>
-                                </a:stretch>
-                              </pic:blipFill>
-                              <pic:spPr>
-                                <a:xfrm>
-                                  <a:off x="359829" y="979542"/>
-                                  <a:ext cx="831646" cy="399834"/>
-                                </a:xfrm>
-                                <a:prstGeom prst="rect">
-                                  <a:avLst/>
-                                </a:prstGeom>
-                              </pic:spPr>
-                            </pic:pic>
-                            <pic:pic xmlns:pic="http://schemas.openxmlformats.org/drawingml/2006/picture">
-                              <pic:nvPicPr>
-                                <pic:cNvPr id="5" name="Image 5"/>
-                                <pic:cNvPicPr/>
-                              </pic:nvPicPr>
-                              <pic:blipFill>
-                                <a:blip r:embed="rId11" cstate="print"/>
-                                <a:stretch>
-                                  <a:fillRect/>
-                                </a:stretch>
-                              </pic:blipFill>
-                              <pic:spPr>
-                                <a:xfrm>
-                                  <a:off x="295338" y="0"/>
-                                  <a:ext cx="839157" cy="365776"/>
-                                </a:xfrm>
-                                <a:prstGeom prst="rect">
-                                  <a:avLst/>
-                                </a:prstGeom>
-                              </pic:spPr>
-                            </pic:pic>
-                            <pic:pic xmlns:pic="http://schemas.openxmlformats.org/drawingml/2006/picture">
-                              <pic:nvPicPr>
-                                <pic:cNvPr id="6" name="Image 6"/>
-                                <pic:cNvPicPr/>
-                              </pic:nvPicPr>
-                              <pic:blipFill>
-                                <a:blip r:embed="rId12" cstate="print"/>
-                                <a:stretch>
-                                  <a:fillRect/>
-                                </a:stretch>
-                              </pic:blipFill>
-                              <pic:spPr>
-                                <a:xfrm>
-                                  <a:off x="661784" y="241278"/>
-                                  <a:ext cx="457923" cy="461086"/>
-                                </a:xfrm>
-                                <a:prstGeom prst="rect">
-                                  <a:avLst/>
-                                </a:prstGeom>
-                              </pic:spPr>
-                            </pic:pic>
-                          </wpg:wgp>
-                        </a:graphicData>
-                      </a:graphic>
-                    </wp:anchor>
-                  </w:drawing>
-                </mc:Choice>
-                <mc:Fallback>
-                  <w:pict>
-                    <v:group w14:anchorId="50D71F1B" id="Group 2" o:spid="_x0000_s1026" style="position:absolute;margin-left:-3.5pt;margin-top:31.1pt;width:93.85pt;height:108.65pt;z-index:-251651072;mso-wrap-distance-left:0;mso-wrap-distance-right:0" coordsize="11918,13798" o:gfxdata="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">
-                      <v:shapetype id="_x0000_t75" coordsize="21600,21600" o:spt="75" o:preferrelative="t" path="m@4@5l@4@11@9@11@9@5xe" filled="f" stroked="f">
-                        <v:stroke joinstyle="miter"/>
-                        <v:formulas>
-                          <v:f eqn="if lineDrawn pixelLineWidth 0"/>
-                          <v:f eqn="sum @0 1 0"/>
-                          <v:f eqn="sum 0 0 @1"/>
-                          <v:f eqn="prod @2 1 2"/>
-                          <v:f eqn="prod @3 21600 pixelWidth"/>
-                          <v:f eqn="prod @3 21600 pixelHeight"/>
-                          <v:f eqn="sum @0 0 1"/>
-                          <v:f eqn="prod @6 1 2"/>
-                          <v:f eqn="prod @7 21600 pixelWidth"/>
-                          <v:f eqn="sum @8 21600 0"/>
-                          <v:f eqn="prod @7 21600 pixelHeight"/>
-                          <v:f eqn="sum @10 21600 0"/>
-                        </v:formulas>
-                        <v:path o:extrusionok="f" gradientshapeok="t" o:connecttype="rect"/>
-                        <o:lock v:ext="edit" aspectratio="t"/>
-                      </v:shapetype>
-                      <v:shape id="Image 3" o:spid="_x0000_s1027" type="#_x0000_t75" style="position:absolute;top:5769;width:7536;height:4320;visibility:visible;mso-wrap-style:square" o:gfxdata="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">
-                        <v:imagedata r:id="rId13" o:title=""/>
-                      </v:shape>
-                      <v:shape id="Image 4" o:spid="_x0000_s1028" type="#_x0000_t75" style="position:absolute;left:3598;top:9795;width:8316;height:3998;visibility:visible;mso-wrap-style:square" o:gfxdata="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">
-                        <v:imagedata r:id="rId14" o:title=""/>
-                      </v:shape>
-                      <v:shape id="Image 5" o:spid="_x0000_s1029" type="#_x0000_t75" style="position:absolute;left:2953;width:8391;height:3657;visibility:visible;mso-wrap-style:square" o:gfxdata="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">
-                        <v:imagedata r:id="rId15" o:title=""/>
-                      </v:shape>
-                      <v:shape id="Image 6" o:spid="_x0000_s1030" type="#_x0000_t75" style="position:absolute;left:6617;top:2412;width:4580;height:4611;visibility:visible;mso-wrap-style:square" o:gfxdata="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">
-                        <v:imagedata r:id="rId16" o:title=""/>
-                      </v:shape>
-                    </v:group>
-                  </w:pict>
-                </mc:Fallback>
-              </mc:AlternateContent>
-            </w:r>
-            <w:r>
-              <w:rPr>
-                <w:b/>
-                <w:spacing w:val="-2"/>
-              </w:rPr>
-              <w:t>Signature</w:t>
-            </w:r>
-          </w:p>
-        </w:tc>
-      </w:tr>
-      <w:tr>
-        <w:trPr>
-          <w:trHeight w:val="489"/>
-        </w:trPr>
-        <w:tc>
-          <w:tcPr>
-            <w:tcW w:w="519" w:type="dxa"/>
-          </w:tcPr>
-          <w:p>
-            <w:pPr>
-              <w:pStyle w:val="TableParagraph"/>
-              <w:spacing w:line="249" w:lineRule="exact"/>
-              <w:ind w:left="72" w:right="49"/>
-              <w:jc w:val="center"/>
-            </w:pPr>
-            <w:r>
-              <w:rPr>
-                <w:spacing w:val="-10"/>
-              </w:rPr>
-              <w:t>1</w:t>
-            </w:r>
-          </w:p>
-        </w:tc>
-        <w:tc>
-          <w:tcPr>
-            <w:tcW w:w="2766" w:type="dxa"/>
-          </w:tcPr>
-          <w:p>
-            <w:pPr>
-              <w:pStyle w:val="TableParagraph"/>
-              <w:spacing w:line="249" w:lineRule="exact"/>
-              <w:ind w:left="4"/>
-            </w:pPr>
-            <w:r>
-              <w:t>Dr.</w:t>
-            </w:r>
-            <w:r>
-              <w:rPr>
-                <w:spacing w:val="-2"/>
-              </w:rPr>
-              <w:t xml:space="preserve"> </w:t>
-            </w:r>
-            <w:r>
-              <w:t>Faisal</w:t>
-            </w:r>
-            <w:r>
-              <w:rPr>
-                <w:spacing w:val="-2"/>
-              </w:rPr>
-              <w:t xml:space="preserve"> Rehman</w:t>
-            </w:r>
-          </w:p>
-        </w:tc>
-        <w:tc>
-          <w:tcPr>
-            <w:tcW w:w="1916" w:type="dxa"/>
-          </w:tcPr>
-          <w:p>
-            <w:pPr>
-              <w:pStyle w:val="TableParagraph"/>
-              <w:spacing w:line="249" w:lineRule="exact"/>
-              <w:ind w:left="61"/>
-            </w:pPr>
-            <w:r>
-              <w:t>Associate</w:t>
-            </w:r>
-            <w:r>
-              <w:rPr>
-                <w:spacing w:val="-11"/>
-              </w:rPr>
-              <w:t xml:space="preserve"> </w:t>
-            </w:r>
-            <w:r>
-              <w:rPr>
-                <w:spacing w:val="-2"/>
-              </w:rPr>
-              <w:t>Professor</w:t>
-            </w:r>
-          </w:p>
-        </w:tc>
-        <w:tc>
-          <w:tcPr>
-            <w:tcW w:w="2253" w:type="dxa"/>
-          </w:tcPr>
-          <w:p>
-            <w:pPr>
-              <w:pStyle w:val="TableParagraph"/>
-              <w:spacing w:before="116"/>
-              <w:ind w:left="12" w:right="9"/>
-              <w:jc w:val="center"/>
-            </w:pPr>
-            <w:r>
-              <w:rPr>
-                <w:spacing w:val="-2"/>
-              </w:rPr>
-              <w:t>Supervisor</w:t>
-            </w:r>
-          </w:p>
-        </w:tc>
-        <w:tc>
-          <w:tcPr>
-            <w:tcW w:w="2157" w:type="dxa"/>
-          </w:tcPr>
-          <w:p>
-            <w:pPr>
-              <w:pStyle w:val="TableParagraph"/>
-            </w:pPr>
-          </w:p>
-        </w:tc>
-      </w:tr>
-      <w:tr>
-        <w:trPr>
-          <w:trHeight w:val="493"/>
-        </w:trPr>
-        <w:tc>
-          <w:tcPr>
-            <w:tcW w:w="519" w:type="dxa"/>
-          </w:tcPr>
-          <w:p>
-            <w:pPr>
-              <w:pStyle w:val="TableParagraph"/>
-              <w:spacing w:line="249" w:lineRule="exact"/>
-              <w:ind w:left="72" w:right="49"/>
-              <w:jc w:val="center"/>
-            </w:pPr>
-            <w:r>
-              <w:rPr>
-                <w:spacing w:val="-10"/>
-              </w:rPr>
-              <w:t>2</w:t>
-            </w:r>
-          </w:p>
-        </w:tc>
-        <w:tc>
-          <w:tcPr>
-            <w:tcW w:w="2766" w:type="dxa"/>
-          </w:tcPr>
-          <w:p>
-            <w:pPr>
-              <w:pStyle w:val="TableParagraph"/>
-              <w:spacing w:line="249" w:lineRule="exact"/>
-              <w:ind w:left="4"/>
-            </w:pPr>
-            <w:r>
-              <w:t>Dr.</w:t>
-            </w:r>
-            <w:r>
-              <w:rPr>
-                <w:spacing w:val="-4"/>
-              </w:rPr>
-              <w:t xml:space="preserve"> </w:t>
-            </w:r>
-            <w:proofErr w:type="spellStart"/>
-            <w:r>
-              <w:t>Ehzaz</w:t>
-            </w:r>
-            <w:proofErr w:type="spellEnd"/>
-            <w:r>
-              <w:rPr>
-                <w:spacing w:val="-2"/>
-              </w:rPr>
-              <w:t xml:space="preserve"> Mustafa</w:t>
-            </w:r>
-          </w:p>
-        </w:tc>
-        <w:tc>
-          <w:tcPr>
-            <w:tcW w:w="1916" w:type="dxa"/>
-          </w:tcPr>
-          <w:p>
-            <w:pPr>
-              <w:pStyle w:val="TableParagraph"/>
-              <w:spacing w:line="249" w:lineRule="exact"/>
-              <w:ind w:left="61"/>
-            </w:pPr>
-            <w:r>
-              <w:rPr>
-                <w:spacing w:val="-2"/>
-              </w:rPr>
-              <w:t>Lecturer</w:t>
-            </w:r>
-          </w:p>
-        </w:tc>
-        <w:tc>
-          <w:tcPr>
-            <w:tcW w:w="2253" w:type="dxa"/>
-          </w:tcPr>
-          <w:p>
-            <w:pPr>
-              <w:pStyle w:val="TableParagraph"/>
-              <w:spacing w:before="116"/>
-              <w:ind w:left="12" w:right="4"/>
-              <w:jc w:val="center"/>
-            </w:pPr>
-            <w:r>
-              <w:t>Co-Supervisor</w:t>
-            </w:r>
-            <w:r>
-              <w:rPr>
-                <w:spacing w:val="-16"/>
-              </w:rPr>
-              <w:t xml:space="preserve"> </w:t>
-            </w:r>
-            <w:r>
-              <w:t>(if</w:t>
-            </w:r>
-            <w:r>
-              <w:rPr>
-                <w:spacing w:val="-13"/>
-              </w:rPr>
-              <w:t xml:space="preserve"> </w:t>
-            </w:r>
-            <w:r>
-              <w:rPr>
-                <w:spacing w:val="-4"/>
-              </w:rPr>
-              <w:t>any)</w:t>
-            </w:r>
-          </w:p>
-        </w:tc>
-        <w:tc>
-          <w:tcPr>
-            <w:tcW w:w="2157" w:type="dxa"/>
-          </w:tcPr>
-          <w:p>
-            <w:pPr>
-              <w:pStyle w:val="TableParagraph"/>
-            </w:pPr>
-          </w:p>
-        </w:tc>
-      </w:tr>
-      <w:tr>
-        <w:trPr>
-          <w:trHeight w:val="493"/>
-        </w:trPr>
-        <w:tc>
-          <w:tcPr>
-            <w:tcW w:w="519" w:type="dxa"/>
-          </w:tcPr>
-          <w:p>
-            <w:pPr>
-              <w:pStyle w:val="TableParagraph"/>
-              <w:spacing w:line="249" w:lineRule="exact"/>
-              <w:ind w:left="72" w:right="49"/>
-              <w:jc w:val="center"/>
-            </w:pPr>
-            <w:bookmarkStart w:id="1" w:name="Untitled"/>
-            <w:bookmarkEnd w:id="1"/>
-            <w:r>
-              <w:rPr>
-                <w:spacing w:val="-10"/>
-              </w:rPr>
-              <w:t>3</w:t>
-            </w:r>
-          </w:p>
-        </w:tc>
-        <w:tc>
-          <w:tcPr>
-            <w:tcW w:w="2766" w:type="dxa"/>
-          </w:tcPr>
-          <w:p>
-            <w:pPr>
-              <w:pStyle w:val="TableParagraph"/>
-              <w:spacing w:line="249" w:lineRule="exact"/>
-              <w:ind w:left="4"/>
-            </w:pPr>
-            <w:r>
-              <w:t>Dr.</w:t>
-            </w:r>
-            <w:r>
-              <w:rPr>
-                <w:spacing w:val="-8"/>
-              </w:rPr>
-              <w:t xml:space="preserve"> </w:t>
-            </w:r>
-            <w:r>
-              <w:t>Sardar</w:t>
-            </w:r>
-            <w:r>
-              <w:rPr>
-                <w:spacing w:val="-5"/>
-              </w:rPr>
-              <w:t xml:space="preserve"> </w:t>
-            </w:r>
-            <w:r>
-              <w:t>Khaliq</w:t>
-            </w:r>
-            <w:r>
-              <w:rPr>
-                <w:spacing w:val="-3"/>
-              </w:rPr>
-              <w:t xml:space="preserve"> </w:t>
-            </w:r>
-            <w:r>
-              <w:t>Uz</w:t>
-            </w:r>
-            <w:r>
-              <w:rPr>
-                <w:spacing w:val="-4"/>
-              </w:rPr>
-              <w:t xml:space="preserve"> Zaman</w:t>
-            </w:r>
-          </w:p>
-        </w:tc>
-        <w:tc>
-          <w:tcPr>
-            <w:tcW w:w="1916" w:type="dxa"/>
-          </w:tcPr>
-          <w:p>
-            <w:pPr>
-              <w:pStyle w:val="TableParagraph"/>
-              <w:spacing w:line="249" w:lineRule="exact"/>
-              <w:ind w:left="61"/>
-            </w:pPr>
-            <w:r>
-              <w:t>Assistant</w:t>
-            </w:r>
-            <w:r>
-              <w:rPr>
-                <w:spacing w:val="-9"/>
-              </w:rPr>
-              <w:t xml:space="preserve"> </w:t>
-            </w:r>
-            <w:r>
-              <w:rPr>
-                <w:spacing w:val="-2"/>
-              </w:rPr>
-              <w:t>Professor</w:t>
-            </w:r>
-          </w:p>
-        </w:tc>
-        <w:tc>
-          <w:tcPr>
-            <w:tcW w:w="2253" w:type="dxa"/>
-          </w:tcPr>
-          <w:p>
-            <w:pPr>
-              <w:pStyle w:val="TableParagraph"/>
-              <w:spacing w:before="116"/>
-              <w:ind w:left="12" w:right="9"/>
-              <w:jc w:val="center"/>
-            </w:pPr>
-            <w:r>
-              <w:rPr>
-                <w:spacing w:val="-2"/>
-              </w:rPr>
-              <w:t>Member</w:t>
-            </w:r>
-          </w:p>
-        </w:tc>
-        <w:tc>
-          <w:tcPr>
-            <w:tcW w:w="2157" w:type="dxa"/>
-          </w:tcPr>
-          <w:p>
-            <w:pPr>
-              <w:pStyle w:val="TableParagraph"/>
-            </w:pPr>
-          </w:p>
-        </w:tc>
-      </w:tr>
-      <w:tr>
-        <w:trPr>
-          <w:trHeight w:val="493"/>
-        </w:trPr>
-        <w:tc>
-          <w:tcPr>
-            <w:tcW w:w="519" w:type="dxa"/>
-          </w:tcPr>
-          <w:p>
-            <w:pPr>
-              <w:pStyle w:val="TableParagraph"/>
-              <w:spacing w:line="249" w:lineRule="exact"/>
-              <w:ind w:left="72" w:right="49"/>
-              <w:jc w:val="center"/>
-            </w:pPr>
-            <w:r>
-              <w:rPr>
-                <w:spacing w:val="-10"/>
-              </w:rPr>
-              <w:t>4</w:t>
-            </w:r>
-          </w:p>
-        </w:tc>
-        <w:tc>
-          <w:tcPr>
-            <w:tcW w:w="2766" w:type="dxa"/>
-          </w:tcPr>
-          <w:p>
-            <w:pPr>
-              <w:pStyle w:val="TableParagraph"/>
-              <w:spacing w:line="244" w:lineRule="exact"/>
-              <w:ind w:left="62"/>
-            </w:pPr>
-            <w:r>
-              <w:t>Dr.</w:t>
-            </w:r>
-            <w:r>
-              <w:rPr>
-                <w:spacing w:val="-1"/>
-              </w:rPr>
-              <w:t xml:space="preserve"> </w:t>
-            </w:r>
-            <w:proofErr w:type="spellStart"/>
-            <w:r>
-              <w:t>Nuhman</w:t>
-            </w:r>
-            <w:proofErr w:type="spellEnd"/>
-            <w:r>
-              <w:rPr>
-                <w:spacing w:val="-7"/>
-              </w:rPr>
-              <w:t xml:space="preserve"> </w:t>
-            </w:r>
-            <w:r>
-              <w:t>ul</w:t>
-            </w:r>
-            <w:r>
-              <w:rPr>
-                <w:spacing w:val="-6"/>
-              </w:rPr>
-              <w:t xml:space="preserve"> </w:t>
-            </w:r>
-            <w:r>
-              <w:rPr>
-                <w:spacing w:val="-5"/>
-              </w:rPr>
-              <w:t>Haq</w:t>
-            </w:r>
-          </w:p>
-        </w:tc>
-        <w:tc>
-          <w:tcPr>
-            <w:tcW w:w="1916" w:type="dxa"/>
-          </w:tcPr>
-          <w:p>
-            <w:pPr>
-              <w:pStyle w:val="TableParagraph"/>
-              <w:spacing w:line="244" w:lineRule="exact"/>
-              <w:ind w:left="61"/>
-            </w:pPr>
-            <w:r>
-              <w:t>Assistant</w:t>
-            </w:r>
-            <w:r>
-              <w:rPr>
-                <w:spacing w:val="-9"/>
-              </w:rPr>
-              <w:t xml:space="preserve"> </w:t>
-            </w:r>
-            <w:r>
-              <w:rPr>
-                <w:spacing w:val="-2"/>
-              </w:rPr>
-              <w:t>Professor</w:t>
-            </w:r>
-          </w:p>
-        </w:tc>
-        <w:tc>
-          <w:tcPr>
-            <w:tcW w:w="2253" w:type="dxa"/>
-          </w:tcPr>
-          <w:p>
-            <w:pPr>
-              <w:pStyle w:val="TableParagraph"/>
-              <w:spacing w:before="116"/>
-              <w:ind w:left="12" w:right="9"/>
-              <w:jc w:val="center"/>
-            </w:pPr>
-            <w:r>
-              <w:rPr>
-                <w:spacing w:val="-2"/>
-              </w:rPr>
-              <w:t>Member</w:t>
-            </w:r>
-          </w:p>
-        </w:tc>
-        <w:tc>
-          <w:tcPr>
-            <w:tcW w:w="2157" w:type="dxa"/>
-          </w:tcPr>
-          <w:p>
-            <w:pPr>
-              <w:pStyle w:val="TableParagraph"/>
-            </w:pPr>
-          </w:p>
-        </w:tc>
-      </w:tr>
-      <w:tr>
-        <w:trPr>
-          <w:trHeight w:val="489"/>
-        </w:trPr>
-        <w:tc>
-          <w:tcPr>
-            <w:tcW w:w="519" w:type="dxa"/>
-          </w:tcPr>
-          <w:p>
-            <w:pPr>
-              <w:pStyle w:val="TableParagraph"/>
-            </w:pPr>
-          </w:p>
-        </w:tc>
-        <w:tc>
-          <w:tcPr>
-            <w:tcW w:w="2766" w:type="dxa"/>
-          </w:tcPr>
-          <w:p>
-            <w:pPr>
-              <w:pStyle w:val="TableParagraph"/>
-            </w:pPr>
-          </w:p>
-        </w:tc>
-        <w:tc>
-          <w:tcPr>
-            <w:tcW w:w="1916" w:type="dxa"/>
-          </w:tcPr>
-          <w:p>
-            <w:pPr>
-              <w:pStyle w:val="TableParagraph"/>
-            </w:pPr>
-          </w:p>
-        </w:tc>
-        <w:tc>
-          <w:tcPr>
-            <w:tcW w:w="2253" w:type="dxa"/>
-          </w:tcPr>
-          <w:p>
-            <w:pPr>
-              <w:pStyle w:val="TableParagraph"/>
-            </w:pPr>
-          </w:p>
-        </w:tc>
-        <w:tc>
-          <w:tcPr>
-            <w:tcW w:w="2157" w:type="dxa"/>
-          </w:tcPr>
-          <w:p>
-            <w:pPr>
-              <w:pStyle w:val="TableParagraph"/>
-            </w:pPr>
-          </w:p>
-        </w:tc>
-      </w:tr>
-    </w:tbl>
-    <w:p>
-      <w:pPr>
-        <w:pStyle w:val="BodyText"/>
-        <w:spacing w:before="7"/>
-        <w:ind w:left="720"/>
-        <w:rPr>
-          <w:b/>
-        </w:rPr>
-      </w:pPr>
-    </w:p>
-    <w:p>
-      <w:pPr>
-        <w:ind w:left="773"/>
-        <w:rPr>
-          <w:b/>
-        </w:rPr>
-      </w:pPr>
-      <w:r>
-        <w:rPr>
-          <w:b/>
-        </w:rPr>
-        <w:t>Consent</w:t>
-      </w:r>
-      <w:r>
-        <w:rPr>
-          <w:b/>
-          <w:spacing w:val="-7"/>
-        </w:rPr>
-        <w:t xml:space="preserve"> </w:t>
-      </w:r>
-      <w:r>
-        <w:rPr>
-          <w:b/>
-        </w:rPr>
-        <w:t>of</w:t>
-      </w:r>
-      <w:r>
-        <w:rPr>
-          <w:b/>
-          <w:spacing w:val="-7"/>
-        </w:rPr>
-        <w:t xml:space="preserve"> </w:t>
-      </w:r>
-      <w:r>
-        <w:rPr>
-          <w:b/>
-          <w:spacing w:val="-2"/>
-        </w:rPr>
-        <w:t>Supervisor:</w:t>
-      </w:r>
-    </w:p>
-    <w:tbl>
-      <w:tblPr>
-        <w:tblW w:w="0" w:type="auto"/>
-        <w:tblInd w:w="836" w:type="dxa"/>
-        <w:tblBorders>
-          <w:top w:val="single" w:sz="4" w:space="0" w:color="000000"/>
-          <w:left w:val="single" w:sz="4" w:space="0" w:color="000000"/>
-          <w:bottom w:val="single" w:sz="4" w:space="0" w:color="000000"/>
-          <w:right w:val="single" w:sz="4" w:space="0" w:color="000000"/>
-          <w:insideH w:val="single" w:sz="4" w:space="0" w:color="000000"/>
-          <w:insideV w:val="single" w:sz="4" w:space="0" w:color="000000"/>
-        </w:tblBorders>
-        <w:tblLayout w:type="fixed"/>
-        <w:tblCellMar>
-          <w:left w:w="0" w:type="dxa"/>
-          <w:right w:w="0" w:type="dxa"/>
-        </w:tblCellMar>
-        <w:tblLook w:val="01E0" w:firstRow="1" w:lastRow="1" w:firstColumn="1" w:lastColumn="1" w:noHBand="0" w:noVBand="0"/>
-      </w:tblPr>
-      <w:tblGrid>
-        <w:gridCol w:w="4557"/>
-        <w:gridCol w:w="3159"/>
-        <w:gridCol w:w="768"/>
-        <w:gridCol w:w="1042"/>
-      </w:tblGrid>
-      <w:tr>
-        <w:trPr>
-          <w:trHeight w:val="345"/>
-        </w:trPr>
-        <w:tc>
-          <w:tcPr>
-            <w:tcW w:w="4557" w:type="dxa"/>
-            <w:vMerge w:val="restart"/>
-          </w:tcPr>
-          <w:p>
-            <w:pPr>
-              <w:pStyle w:val="TableParagraph"/>
-              <w:rPr>
-                <w:b/>
-              </w:rPr>
-            </w:pPr>
-          </w:p>
-          <w:p>
-            <w:pPr>
-              <w:pStyle w:val="TableParagraph"/>
-              <w:spacing w:before="109"/>
-              <w:rPr>
-                <w:b/>
-              </w:rPr>
-            </w:pPr>
-          </w:p>
-          <w:p>
-            <w:pPr>
-              <w:pStyle w:val="TableParagraph"/>
-              <w:spacing w:line="278" w:lineRule="auto"/>
-              <w:ind w:left="110" w:right="143" w:firstLine="57"/>
-            </w:pPr>
-            <w:r>
-              <w:t>I</w:t>
-            </w:r>
-            <w:r>
-              <w:rPr>
-                <w:spacing w:val="-3"/>
-              </w:rPr>
-              <w:t xml:space="preserve"> </w:t>
-            </w:r>
-            <w:r>
-              <w:t>do</w:t>
-            </w:r>
-            <w:r>
-              <w:rPr>
-                <w:spacing w:val="-6"/>
-              </w:rPr>
-              <w:t xml:space="preserve"> </w:t>
-            </w:r>
-            <w:r>
-              <w:t>hereby</w:t>
-            </w:r>
-            <w:r>
-              <w:rPr>
-                <w:spacing w:val="-4"/>
-              </w:rPr>
-              <w:t xml:space="preserve"> </w:t>
-            </w:r>
-            <w:r>
-              <w:t>agree</w:t>
-            </w:r>
-            <w:r>
-              <w:rPr>
-                <w:spacing w:val="-8"/>
-              </w:rPr>
-              <w:t xml:space="preserve"> </w:t>
-            </w:r>
-            <w:r>
-              <w:t>to</w:t>
-            </w:r>
-            <w:r>
-              <w:rPr>
-                <w:spacing w:val="-5"/>
-              </w:rPr>
-              <w:t xml:space="preserve"> </w:t>
-            </w:r>
-            <w:r>
-              <w:t>supervise</w:t>
-            </w:r>
-            <w:r>
-              <w:rPr>
-                <w:spacing w:val="-8"/>
-              </w:rPr>
-              <w:t xml:space="preserve"> </w:t>
-            </w:r>
-            <w:r>
-              <w:t>the</w:t>
-            </w:r>
-            <w:r>
-              <w:rPr>
-                <w:spacing w:val="-8"/>
-              </w:rPr>
-              <w:t xml:space="preserve"> </w:t>
-            </w:r>
-            <w:r>
-              <w:t>above</w:t>
-            </w:r>
-            <w:r>
-              <w:rPr>
-                <w:spacing w:val="-6"/>
-              </w:rPr>
-              <w:t xml:space="preserve"> </w:t>
-            </w:r>
-            <w:r>
-              <w:t>student for his/her PhD studies.</w:t>
-            </w:r>
-          </w:p>
-        </w:tc>
-        <w:tc>
-          <w:tcPr>
-            <w:tcW w:w="3159" w:type="dxa"/>
-            <w:vMerge w:val="restart"/>
-          </w:tcPr>
-          <w:p>
-            <w:pPr>
-              <w:pStyle w:val="TableParagraph"/>
-              <w:spacing w:before="94" w:line="237" w:lineRule="auto"/>
-              <w:ind w:left="110" w:right="122"/>
-            </w:pPr>
-            <w:r>
-              <w:t>Number</w:t>
-            </w:r>
-            <w:r>
-              <w:rPr>
-                <w:spacing w:val="-14"/>
-              </w:rPr>
-              <w:t xml:space="preserve"> </w:t>
-            </w:r>
-            <w:r>
-              <w:t>of</w:t>
-            </w:r>
-            <w:r>
-              <w:rPr>
-                <w:spacing w:val="-14"/>
-              </w:rPr>
-              <w:t xml:space="preserve"> </w:t>
-            </w:r>
-            <w:r>
-              <w:t>previously</w:t>
-            </w:r>
-            <w:r>
-              <w:rPr>
-                <w:spacing w:val="-14"/>
-              </w:rPr>
-              <w:t xml:space="preserve"> </w:t>
-            </w:r>
-            <w:r>
-              <w:t>supervised students, who have graduated</w:t>
-            </w:r>
-          </w:p>
-        </w:tc>
-        <w:tc>
-          <w:tcPr>
-            <w:tcW w:w="768" w:type="dxa"/>
-          </w:tcPr>
-          <w:p>
-            <w:pPr>
-              <w:pStyle w:val="TableParagraph"/>
-              <w:spacing w:before="39"/>
-              <w:ind w:left="26" w:right="13"/>
-              <w:jc w:val="center"/>
-            </w:pPr>
-            <w:r>
-              <w:rPr>
-                <w:spacing w:val="-5"/>
-              </w:rPr>
-              <w:t>MS</w:t>
-            </w:r>
-          </w:p>
-        </w:tc>
-        <w:tc>
-          <w:tcPr>
-            <w:tcW w:w="1042" w:type="dxa"/>
-          </w:tcPr>
-          <w:p>
-            <w:pPr>
-              <w:pStyle w:val="TableParagraph"/>
-              <w:spacing w:before="10"/>
-              <w:ind w:right="293"/>
-              <w:jc w:val="center"/>
-              <w:rPr>
-                <w:rFonts w:ascii="Arial MT"/>
-                <w:sz w:val="24"/>
-              </w:rPr>
-            </w:pPr>
-            <w:r>
-              <w:rPr>
-                <w:rFonts w:ascii="Arial MT"/>
-                <w:spacing w:val="-5"/>
-                <w:sz w:val="24"/>
-              </w:rPr>
-              <w:t>21</w:t>
-            </w:r>
-          </w:p>
-        </w:tc>
-      </w:tr>
-      <w:tr>
-        <w:trPr>
-          <w:trHeight w:val="345"/>
-        </w:trPr>
-        <w:tc>
-          <w:tcPr>
-            <w:tcW w:w="4557" w:type="dxa"/>
-            <w:vMerge/>
-            <w:tcBorders>
-              <w:top w:val="nil"/>
-            </w:tcBorders>
-          </w:tcPr>
-          <w:p>
-            <w:pPr>
-              <w:rPr>
-                <w:sz w:val="2"/>
-                <w:szCs w:val="2"/>
-              </w:rPr>
-            </w:pPr>
-          </w:p>
-        </w:tc>
-        <w:tc>
-          <w:tcPr>
-            <w:tcW w:w="3159" w:type="dxa"/>
-            <w:vMerge/>
-            <w:tcBorders>
-              <w:top w:val="nil"/>
-            </w:tcBorders>
-          </w:tcPr>
-          <w:p>
-            <w:pPr>
-              <w:rPr>
-                <w:sz w:val="2"/>
-                <w:szCs w:val="2"/>
-              </w:rPr>
-            </w:pPr>
-          </w:p>
-        </w:tc>
-        <w:tc>
-          <w:tcPr>
-            <w:tcW w:w="768" w:type="dxa"/>
-          </w:tcPr>
-          <w:p>
-            <w:pPr>
-              <w:pStyle w:val="TableParagraph"/>
-              <w:spacing w:before="39"/>
-              <w:ind w:left="26"/>
-              <w:jc w:val="center"/>
-            </w:pPr>
-            <w:r>
-              <w:rPr>
-                <w:spacing w:val="-5"/>
-              </w:rPr>
-              <w:t>PhD</w:t>
-            </w:r>
-          </w:p>
-        </w:tc>
-        <w:tc>
-          <w:tcPr>
-            <w:tcW w:w="1042" w:type="dxa"/>
-          </w:tcPr>
-          <w:p>
-            <w:pPr>
-              <w:pStyle w:val="TableParagraph"/>
-              <w:spacing w:before="35"/>
-              <w:ind w:right="326"/>
-              <w:jc w:val="center"/>
-              <w:rPr>
-                <w:rFonts w:ascii="Arial MT"/>
-                <w:sz w:val="24"/>
-              </w:rPr>
-            </w:pPr>
-            <w:r>
-              <w:rPr>
-                <w:rFonts w:ascii="Arial MT"/>
-                <w:spacing w:val="-10"/>
-                <w:sz w:val="24"/>
-              </w:rPr>
-              <w:t>2</w:t>
-            </w:r>
-          </w:p>
-        </w:tc>
-      </w:tr>
-      <w:tr>
-        <w:trPr>
-          <w:trHeight w:val="345"/>
-        </w:trPr>
-        <w:tc>
-          <w:tcPr>
-            <w:tcW w:w="4557" w:type="dxa"/>
-            <w:vMerge/>
-            <w:tcBorders>
-              <w:top w:val="nil"/>
-            </w:tcBorders>
-          </w:tcPr>
-          <w:p>
-            <w:pPr>
-              <w:rPr>
-                <w:sz w:val="2"/>
-                <w:szCs w:val="2"/>
-              </w:rPr>
-            </w:pPr>
-          </w:p>
-        </w:tc>
-        <w:tc>
-          <w:tcPr>
-            <w:tcW w:w="3159" w:type="dxa"/>
-            <w:vMerge w:val="restart"/>
-          </w:tcPr>
-          <w:p>
-            <w:pPr>
-              <w:pStyle w:val="TableParagraph"/>
-              <w:spacing w:before="94" w:line="237" w:lineRule="auto"/>
-              <w:ind w:left="110" w:right="122"/>
-            </w:pPr>
-            <w:r>
-              <w:t>Number</w:t>
-            </w:r>
-            <w:r>
-              <w:rPr>
-                <w:spacing w:val="40"/>
-              </w:rPr>
-              <w:t xml:space="preserve"> </w:t>
-            </w:r>
-            <w:r>
-              <w:t>of</w:t>
-            </w:r>
-            <w:r>
-              <w:rPr>
-                <w:spacing w:val="40"/>
-              </w:rPr>
-              <w:t xml:space="preserve"> </w:t>
-            </w:r>
-            <w:r>
-              <w:t>students</w:t>
-            </w:r>
-            <w:r>
-              <w:rPr>
-                <w:spacing w:val="40"/>
-              </w:rPr>
-              <w:t xml:space="preserve"> </w:t>
-            </w:r>
-            <w:r>
-              <w:t>currently under supervision</w:t>
-            </w:r>
-          </w:p>
-        </w:tc>
-        <w:tc>
-          <w:tcPr>
-            <w:tcW w:w="768" w:type="dxa"/>
-          </w:tcPr>
-          <w:p>
-            <w:pPr>
-              <w:pStyle w:val="TableParagraph"/>
-              <w:spacing w:before="39"/>
-              <w:ind w:left="26" w:right="3"/>
-              <w:jc w:val="center"/>
-            </w:pPr>
-            <w:r>
-              <w:rPr>
-                <w:spacing w:val="-5"/>
-              </w:rPr>
-              <w:t>MS</w:t>
-            </w:r>
-          </w:p>
-        </w:tc>
-        <w:tc>
-          <w:tcPr>
-            <w:tcW w:w="1042" w:type="dxa"/>
-          </w:tcPr>
-          <w:p>
-            <w:pPr>
-              <w:pStyle w:val="TableParagraph"/>
-              <w:spacing w:before="19"/>
-              <w:ind w:left="20" w:right="326"/>
-              <w:jc w:val="center"/>
-              <w:rPr>
-                <w:rFonts w:ascii="Arial MT"/>
-                <w:sz w:val="24"/>
-              </w:rPr>
-            </w:pPr>
-            <w:r>
-              <w:rPr>
-                <w:rFonts w:ascii="Arial MT"/>
-                <w:spacing w:val="-10"/>
-                <w:sz w:val="24"/>
-              </w:rPr>
-              <w:t>1</w:t>
-            </w:r>
-          </w:p>
-        </w:tc>
-      </w:tr>
-      <w:tr>
-        <w:trPr>
-          <w:trHeight w:val="345"/>
-        </w:trPr>
-        <w:tc>
-          <w:tcPr>
-            <w:tcW w:w="4557" w:type="dxa"/>
-            <w:vMerge/>
-            <w:tcBorders>
-              <w:top w:val="nil"/>
-            </w:tcBorders>
-          </w:tcPr>
-          <w:p>
-            <w:pPr>
-              <w:rPr>
-                <w:sz w:val="2"/>
-                <w:szCs w:val="2"/>
-              </w:rPr>
-            </w:pPr>
-          </w:p>
-        </w:tc>
-        <w:tc>
-          <w:tcPr>
-            <w:tcW w:w="3159" w:type="dxa"/>
-            <w:vMerge/>
-            <w:tcBorders>
-              <w:top w:val="nil"/>
-            </w:tcBorders>
-          </w:tcPr>
-          <w:p>
-            <w:pPr>
-              <w:rPr>
-                <w:sz w:val="2"/>
-                <w:szCs w:val="2"/>
-              </w:rPr>
-            </w:pPr>
-          </w:p>
-        </w:tc>
-        <w:tc>
-          <w:tcPr>
-            <w:tcW w:w="768" w:type="dxa"/>
-          </w:tcPr>
-          <w:p>
-            <w:pPr>
-              <w:pStyle w:val="TableParagraph"/>
-              <w:spacing w:before="39"/>
-              <w:ind w:left="26"/>
-              <w:jc w:val="center"/>
-            </w:pPr>
-            <w:r>
-              <w:rPr>
-                <w:spacing w:val="-5"/>
-              </w:rPr>
-              <w:t>PhD</w:t>
-            </w:r>
-          </w:p>
-        </w:tc>
-        <w:tc>
-          <w:tcPr>
-            <w:tcW w:w="1042" w:type="dxa"/>
-          </w:tcPr>
-          <w:p>
-            <w:pPr>
-              <w:pStyle w:val="TableParagraph"/>
-            </w:pPr>
-          </w:p>
-        </w:tc>
-      </w:tr>
-      <w:tr>
-        <w:trPr>
-          <w:trHeight w:val="393"/>
-        </w:trPr>
-        <w:tc>
-          <w:tcPr>
-            <w:tcW w:w="4557" w:type="dxa"/>
-            <w:vMerge/>
-            <w:tcBorders>
-              <w:top w:val="nil"/>
-            </w:tcBorders>
-          </w:tcPr>
-          <w:p>
-            <w:pPr>
-              <w:rPr>
-                <w:sz w:val="2"/>
-                <w:szCs w:val="2"/>
-              </w:rPr>
-            </w:pPr>
-          </w:p>
-        </w:tc>
-        <w:tc>
-          <w:tcPr>
-            <w:tcW w:w="3159" w:type="dxa"/>
-          </w:tcPr>
-          <w:p>
-            <w:pPr>
-              <w:pStyle w:val="TableParagraph"/>
-              <w:spacing w:before="63"/>
-              <w:ind w:left="110"/>
-            </w:pPr>
-            <w:r>
-              <w:t>I</w:t>
-            </w:r>
-            <w:r>
-              <w:rPr>
-                <w:spacing w:val="-6"/>
-              </w:rPr>
-              <w:t xml:space="preserve"> </w:t>
-            </w:r>
-            <w:r>
-              <w:t>am</w:t>
-            </w:r>
-            <w:r>
-              <w:rPr>
-                <w:spacing w:val="-9"/>
-              </w:rPr>
-              <w:t xml:space="preserve"> </w:t>
-            </w:r>
-            <w:r>
-              <w:t>HEC</w:t>
-            </w:r>
-            <w:r>
-              <w:rPr>
-                <w:spacing w:val="-3"/>
-              </w:rPr>
-              <w:t xml:space="preserve"> </w:t>
-            </w:r>
-            <w:r>
-              <w:t>approved</w:t>
-            </w:r>
-            <w:r>
-              <w:rPr>
-                <w:spacing w:val="-8"/>
-              </w:rPr>
-              <w:t xml:space="preserve"> </w:t>
-            </w:r>
-            <w:r>
-              <w:rPr>
-                <w:spacing w:val="-2"/>
-              </w:rPr>
-              <w:t>supervisor</w:t>
-            </w:r>
-          </w:p>
-        </w:tc>
-        <w:tc>
-          <w:tcPr>
-            <w:tcW w:w="768" w:type="dxa"/>
-          </w:tcPr>
-          <w:p>
-            <w:pPr>
-              <w:pStyle w:val="TableParagraph"/>
-              <w:spacing w:before="63"/>
-              <w:ind w:left="26" w:right="16"/>
-              <w:jc w:val="center"/>
-            </w:pPr>
-            <w:r>
-              <w:rPr>
-                <w:spacing w:val="-5"/>
-              </w:rPr>
-              <w:t>Yes</w:t>
-            </w:r>
-          </w:p>
-        </w:tc>
-        <w:tc>
-          <w:tcPr>
-            <w:tcW w:w="1042" w:type="dxa"/>
-          </w:tcPr>
-          <w:p>
-            <w:pPr>
-              <w:pStyle w:val="TableParagraph"/>
-            </w:pPr>
-          </w:p>
-        </w:tc>
-      </w:tr>
-      <w:tr>
-        <w:trPr>
-          <w:trHeight w:val="763"/>
-        </w:trPr>
-        <w:tc>
-          <w:tcPr>
-            <w:tcW w:w="9526" w:type="dxa"/>
-            <w:gridSpan w:val="4"/>
-          </w:tcPr>
-          <w:p>
-            <w:pPr>
-              <w:pStyle w:val="TableParagraph"/>
-              <w:spacing w:before="245"/>
-              <w:ind w:left="110"/>
-              <w:rPr>
-                <w:rFonts w:ascii="Arial MT"/>
-                <w:sz w:val="24"/>
-              </w:rPr>
-            </w:pPr>
-            <w:r>
-              <w:rPr>
-                <w:rFonts w:ascii="Arial MT"/>
-                <w:noProof/>
-                <w:sz w:val="24"/>
-              </w:rPr>
-              <mc:AlternateContent>
-                <mc:Choice Requires="wpg">
-                  <w:drawing>
-                    <wp:anchor distT="0" distB="0" distL="0" distR="0" simplePos="0" relativeHeight="251663360" behindDoc="0" locked="0" layoutInCell="1" allowOverlap="1" wp14:anchorId="1AC93F63" wp14:editId="35917DD3">
-                      <wp:simplePos x="0" y="0"/>
-                      <wp:positionH relativeFrom="column">
-                        <wp:posOffset>3626471</wp:posOffset>
-                      </wp:positionH>
-                      <wp:positionV relativeFrom="paragraph">
-                        <wp:posOffset>53591</wp:posOffset>
-                      </wp:positionV>
-                      <wp:extent cx="1042950" cy="393405"/>
-                      <wp:effectExtent l="0" t="0" r="0" b="635"/>
-                      <wp:wrapNone/>
-                      <wp:docPr id="7" name="Group 7"/>
-                      <wp:cNvGraphicFramePr>
-                        <a:graphicFrameLocks xmlns:a="http://schemas.openxmlformats.org/drawingml/2006/main"/>
-                      </wp:cNvGraphicFramePr>
-                      <a:graphic xmlns:a="http://schemas.openxmlformats.org/drawingml/2006/main">
-                        <a:graphicData uri="http://schemas.microsoft.com/office/word/2010/wordprocessingGroup">
-                          <wpg:wgp>
-                            <wpg:cNvGrpSpPr>
-                              <a:grpSpLocks/>
-                            </wpg:cNvGrpSpPr>
-                            <wpg:grpSpPr>
-                              <a:xfrm>
-                                <a:off x="0" y="0"/>
-                                <a:ext cx="1042950" cy="393405"/>
-                                <a:chOff x="0" y="0"/>
-                                <a:chExt cx="1043305" cy="452755"/>
-                              </a:xfrm>
-                            </wpg:grpSpPr>
-                            <pic:pic xmlns:pic="http://schemas.openxmlformats.org/drawingml/2006/picture">
-                              <pic:nvPicPr>
-                                <pic:cNvPr id="8" name="Image 8"/>
-                                <pic:cNvPicPr/>
-                              </pic:nvPicPr>
-                              <pic:blipFill>
-                                <a:blip r:embed="rId11" cstate="print"/>
-                                <a:stretch>
-                                  <a:fillRect/>
-                                </a:stretch>
-                              </pic:blipFill>
-                              <pic:spPr>
-                                <a:xfrm>
-                                  <a:off x="0" y="0"/>
-                                  <a:ext cx="1042950" cy="452571"/>
-                                </a:xfrm>
-                                <a:prstGeom prst="rect">
-                                  <a:avLst/>
-                                </a:prstGeom>
-                              </pic:spPr>
-                            </pic:pic>
-                          </wpg:wgp>
-                        </a:graphicData>
-                      </a:graphic>
-                      <wp14:sizeRelH relativeFrom="margin">
-                        <wp14:pctWidth>0</wp14:pctWidth>
-                      </wp14:sizeRelH>
-                      <wp14:sizeRelV relativeFrom="margin">
-                        <wp14:pctHeight>0</wp14:pctHeight>
-                      </wp14:sizeRelV>
-                    </wp:anchor>
-                  </w:drawing>
-                </mc:Choice>
-                <mc:Fallback>
-                  <w:pict>
-                    <v:group w14:anchorId="72FBC5E4" id="Group 7" o:spid="_x0000_s1026" style="position:absolute;margin-left:285.55pt;margin-top:4.2pt;width:82.1pt;height:31pt;z-index:251663360;mso-wrap-distance-left:0;mso-wrap-distance-right:0;mso-width-relative:margin;mso-height-relative:margin" coordsize="10433,4527" o:gfxdata="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">
-                      <v:shape id="Image 8" o:spid="_x0000_s1027" type="#_x0000_t75" style="position:absolute;width:10429;height:4525;visibility:visible;mso-wrap-style:square" o:gfxdata="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">
-                        <v:imagedata r:id="rId15" o:title=""/>
-                      </v:shape>
-                    </v:group>
-                  </w:pict>
-                </mc:Fallback>
-              </mc:AlternateContent>
-            </w:r>
-            <w:r>
-              <w:rPr>
-                <w:b/>
-                <w:i/>
-                <w:position w:val="2"/>
-              </w:rPr>
-              <w:t>Name</w:t>
-            </w:r>
-            <w:r>
-              <w:rPr>
-                <w:b/>
-                <w:i/>
-                <w:spacing w:val="-10"/>
-                <w:position w:val="2"/>
-              </w:rPr>
-              <w:t xml:space="preserve"> </w:t>
-            </w:r>
-            <w:r>
-              <w:rPr>
-                <w:b/>
-                <w:i/>
-                <w:position w:val="2"/>
-              </w:rPr>
-              <w:t>and</w:t>
-            </w:r>
-            <w:r>
-              <w:rPr>
-                <w:b/>
-                <w:i/>
-                <w:spacing w:val="-1"/>
-                <w:position w:val="2"/>
-              </w:rPr>
-              <w:t xml:space="preserve"> </w:t>
-            </w:r>
-            <w:r>
-              <w:rPr>
-                <w:b/>
-                <w:i/>
-                <w:position w:val="2"/>
-              </w:rPr>
-              <w:t>Signature</w:t>
-            </w:r>
-            <w:r>
-              <w:rPr>
-                <w:b/>
-                <w:i/>
-                <w:spacing w:val="-7"/>
-                <w:position w:val="2"/>
-              </w:rPr>
-              <w:t xml:space="preserve"> </w:t>
-            </w:r>
-            <w:r>
-              <w:rPr>
-                <w:b/>
-                <w:i/>
-                <w:position w:val="2"/>
-              </w:rPr>
-              <w:t>of</w:t>
-            </w:r>
-            <w:r>
-              <w:rPr>
-                <w:b/>
-                <w:i/>
-                <w:spacing w:val="-12"/>
-                <w:position w:val="2"/>
-              </w:rPr>
-              <w:t xml:space="preserve"> </w:t>
-            </w:r>
-            <w:r>
-              <w:rPr>
-                <w:b/>
-                <w:i/>
-                <w:position w:val="2"/>
-              </w:rPr>
-              <w:t>Supervisor:</w:t>
-            </w:r>
-            <w:r>
-              <w:rPr>
-                <w:b/>
-                <w:i/>
-                <w:spacing w:val="72"/>
-                <w:position w:val="2"/>
-              </w:rPr>
-              <w:t xml:space="preserve"> </w:t>
-            </w:r>
-            <w:r>
-              <w:rPr>
-                <w:rFonts w:ascii="Arial MT"/>
-                <w:sz w:val="24"/>
-              </w:rPr>
-              <w:t>Dr.</w:t>
-            </w:r>
-            <w:r>
-              <w:rPr>
-                <w:rFonts w:ascii="Arial MT"/>
-                <w:spacing w:val="-4"/>
-                <w:sz w:val="24"/>
-              </w:rPr>
-              <w:t xml:space="preserve"> </w:t>
-            </w:r>
-            <w:r>
-              <w:rPr>
-                <w:rFonts w:ascii="Arial MT"/>
-                <w:sz w:val="24"/>
-              </w:rPr>
-              <w:t>Faisal</w:t>
-            </w:r>
-            <w:r>
-              <w:rPr>
-                <w:rFonts w:ascii="Arial MT"/>
-                <w:spacing w:val="-4"/>
-                <w:sz w:val="24"/>
-              </w:rPr>
-              <w:t xml:space="preserve"> </w:t>
-            </w:r>
-            <w:r>
-              <w:rPr>
-                <w:rFonts w:ascii="Arial MT"/>
-                <w:spacing w:val="-2"/>
-                <w:sz w:val="24"/>
-              </w:rPr>
-              <w:t>Rehman</w:t>
-            </w:r>
-          </w:p>
-        </w:tc>
-      </w:tr>
-    </w:tbl>
-    <w:p>
-      <w:pPr>
-        <w:pStyle w:val="BodyText"/>
-        <w:spacing w:before="45"/>
-        <w:ind w:left="720"/>
-        <w:rPr>
-          <w:b/>
-          <w:sz w:val="20"/>
-        </w:rPr>
-      </w:pPr>
-    </w:p>
-    <w:tbl>
-      <w:tblPr>
-        <w:tblW w:w="0" w:type="auto"/>
-        <w:tblInd w:w="836" w:type="dxa"/>
-        <w:tblBorders>
-          <w:top w:val="single" w:sz="4" w:space="0" w:color="000000"/>
-          <w:left w:val="single" w:sz="4" w:space="0" w:color="000000"/>
-          <w:bottom w:val="single" w:sz="4" w:space="0" w:color="000000"/>
-          <w:right w:val="single" w:sz="4" w:space="0" w:color="000000"/>
-          <w:insideH w:val="single" w:sz="4" w:space="0" w:color="000000"/>
-          <w:insideV w:val="single" w:sz="4" w:space="0" w:color="000000"/>
-        </w:tblBorders>
-        <w:tblLayout w:type="fixed"/>
-        <w:tblCellMar>
-          <w:left w:w="0" w:type="dxa"/>
-          <w:right w:w="0" w:type="dxa"/>
-        </w:tblCellMar>
-        <w:tblLook w:val="01E0" w:firstRow="1" w:lastRow="1" w:firstColumn="1" w:lastColumn="1" w:noHBand="0" w:noVBand="0"/>
-      </w:tblPr>
-      <w:tblGrid>
-        <w:gridCol w:w="4663"/>
-        <w:gridCol w:w="4860"/>
-      </w:tblGrid>
-      <w:tr>
-        <w:trPr>
-          <w:trHeight w:val="508"/>
-        </w:trPr>
-        <w:tc>
-          <w:tcPr>
-            <w:tcW w:w="4663" w:type="dxa"/>
-          </w:tcPr>
-          <w:p>
-            <w:pPr>
-              <w:pStyle w:val="TableParagraph"/>
-              <w:spacing w:line="254" w:lineRule="exact"/>
-              <w:ind w:left="110" w:right="764"/>
-              <w:rPr>
-                <w:b/>
-              </w:rPr>
-            </w:pPr>
-            <w:r>
-              <w:rPr>
-                <w:b/>
-              </w:rPr>
-              <w:t>Approval</w:t>
-            </w:r>
-            <w:r>
-              <w:rPr>
-                <w:b/>
-                <w:spacing w:val="-14"/>
-              </w:rPr>
-              <w:t xml:space="preserve"> </w:t>
-            </w:r>
-            <w:r>
-              <w:rPr>
-                <w:b/>
-              </w:rPr>
-              <w:t>of</w:t>
-            </w:r>
-            <w:r>
-              <w:rPr>
-                <w:b/>
-                <w:spacing w:val="-14"/>
-              </w:rPr>
-              <w:t xml:space="preserve"> </w:t>
-            </w:r>
-            <w:r>
-              <w:rPr>
-                <w:b/>
-              </w:rPr>
-              <w:t>the</w:t>
-            </w:r>
-            <w:r>
-              <w:rPr>
-                <w:b/>
-                <w:spacing w:val="-14"/>
-              </w:rPr>
-              <w:t xml:space="preserve"> </w:t>
-            </w:r>
-            <w:r>
-              <w:rPr>
-                <w:b/>
-              </w:rPr>
-              <w:t>Convener</w:t>
-            </w:r>
-            <w:r>
-              <w:rPr>
-                <w:b/>
-                <w:spacing w:val="-14"/>
-              </w:rPr>
-              <w:t xml:space="preserve"> </w:t>
-            </w:r>
-            <w:r>
-              <w:rPr>
-                <w:b/>
-              </w:rPr>
-              <w:t>Departmental Advisory Committee (Chair/</w:t>
-            </w:r>
-            <w:proofErr w:type="spellStart"/>
-            <w:r>
-              <w:rPr>
-                <w:b/>
-              </w:rPr>
-              <w:t>HoD</w:t>
-            </w:r>
-            <w:proofErr w:type="spellEnd"/>
-            <w:r>
-              <w:rPr>
-                <w:b/>
-              </w:rPr>
-              <w:t>)</w:t>
-            </w:r>
-          </w:p>
-        </w:tc>
-        <w:tc>
-          <w:tcPr>
-            <w:tcW w:w="4860" w:type="dxa"/>
-          </w:tcPr>
-          <w:p>
-            <w:pPr>
-              <w:pStyle w:val="TableParagraph"/>
-              <w:spacing w:before="94" w:line="251" w:lineRule="exact"/>
-              <w:ind w:left="49"/>
-              <w:rPr>
-                <w:b/>
-                <w:position w:val="5"/>
-                <w:sz w:val="20"/>
-              </w:rPr>
-            </w:pPr>
-            <w:r>
-              <w:rPr>
-                <w:b/>
-              </w:rPr>
-              <w:t>Approval</w:t>
-            </w:r>
-            <w:r>
-              <w:rPr>
-                <w:b/>
-                <w:spacing w:val="-16"/>
-              </w:rPr>
-              <w:t xml:space="preserve"> </w:t>
-            </w:r>
-            <w:r>
-              <w:rPr>
-                <w:b/>
-              </w:rPr>
-              <w:t>of</w:t>
-            </w:r>
-            <w:r>
-              <w:rPr>
-                <w:b/>
-                <w:spacing w:val="-19"/>
-              </w:rPr>
-              <w:t xml:space="preserve"> </w:t>
-            </w:r>
-            <w:r>
-              <w:rPr>
-                <w:b/>
-              </w:rPr>
-              <w:t>the</w:t>
-            </w:r>
-            <w:r>
-              <w:rPr>
-                <w:b/>
-                <w:spacing w:val="-14"/>
-              </w:rPr>
-              <w:t xml:space="preserve"> </w:t>
-            </w:r>
-            <w:r>
-              <w:rPr>
-                <w:b/>
-              </w:rPr>
-              <w:t>Dean</w:t>
-            </w:r>
-            <w:r>
-              <w:rPr>
-                <w:b/>
-                <w:spacing w:val="2"/>
-              </w:rPr>
-              <w:t xml:space="preserve"> </w:t>
-            </w:r>
-            <w:r>
-              <w:rPr>
-                <w:b/>
-              </w:rPr>
-              <w:t>Faculty</w:t>
-            </w:r>
-            <w:r>
-              <w:rPr>
-                <w:b/>
-                <w:spacing w:val="-22"/>
-              </w:rPr>
-              <w:t xml:space="preserve"> </w:t>
-            </w:r>
-            <w:r>
-              <w:rPr>
-                <w:b/>
-              </w:rPr>
-              <w:t>of</w:t>
-            </w:r>
-            <w:r>
-              <w:rPr>
-                <w:b/>
-                <w:spacing w:val="-19"/>
-              </w:rPr>
-              <w:t xml:space="preserve"> </w:t>
-            </w:r>
-            <w:r>
-              <w:rPr>
-                <w:b/>
-                <w:position w:val="5"/>
-                <w:sz w:val="20"/>
-              </w:rPr>
-              <w:t>In</w:t>
-            </w:r>
-            <w:r>
-              <w:rPr>
-                <w:b/>
-                <w:position w:val="5"/>
-                <w:sz w:val="20"/>
-                <w:u w:val="single"/>
-              </w:rPr>
-              <w:t>formation</w:t>
-            </w:r>
-            <w:r>
-              <w:rPr>
-                <w:b/>
-                <w:spacing w:val="-2"/>
-                <w:position w:val="5"/>
-                <w:sz w:val="20"/>
-                <w:u w:val="single"/>
-              </w:rPr>
-              <w:t xml:space="preserve"> Scienc</w:t>
-            </w:r>
-            <w:r>
-              <w:rPr>
-                <w:b/>
-                <w:spacing w:val="-2"/>
-                <w:position w:val="5"/>
-                <w:sz w:val="20"/>
-              </w:rPr>
-              <w:t>e</w:t>
-            </w:r>
-          </w:p>
-          <w:p>
-            <w:pPr>
-              <w:pStyle w:val="TableParagraph"/>
-              <w:spacing w:line="143" w:lineRule="exact"/>
-              <w:ind w:left="3215"/>
-              <w:rPr>
-                <w:b/>
-                <w:sz w:val="20"/>
-              </w:rPr>
-            </w:pPr>
-            <w:r>
-              <w:rPr>
-                <w:b/>
-                <w:sz w:val="20"/>
-              </w:rPr>
-              <w:t xml:space="preserve">&amp; </w:t>
-            </w:r>
-            <w:r>
-              <w:rPr>
-                <w:b/>
-                <w:spacing w:val="-2"/>
-                <w:sz w:val="20"/>
-              </w:rPr>
-              <w:t>Technology</w:t>
-            </w:r>
-          </w:p>
-        </w:tc>
-      </w:tr>
-      <w:tr>
-        <w:trPr>
-          <w:trHeight w:val="503"/>
-        </w:trPr>
-        <w:tc>
-          <w:tcPr>
-            <w:tcW w:w="4663" w:type="dxa"/>
-          </w:tcPr>
-          <w:p>
-            <w:pPr>
-              <w:pStyle w:val="TableParagraph"/>
-              <w:ind w:left="110"/>
-              <w:rPr>
-                <w:rFonts w:ascii="Arial MT"/>
-                <w:sz w:val="24"/>
-              </w:rPr>
-            </w:pPr>
-            <w:r>
-              <w:rPr>
-                <w:position w:val="5"/>
-              </w:rPr>
-              <w:t>Name:</w:t>
-            </w:r>
-            <w:r>
-              <w:rPr>
-                <w:spacing w:val="56"/>
-                <w:position w:val="5"/>
-              </w:rPr>
-              <w:t xml:space="preserve"> </w:t>
-            </w:r>
-            <w:r>
-              <w:rPr>
-                <w:rFonts w:ascii="Arial MT"/>
-                <w:sz w:val="24"/>
-              </w:rPr>
-              <w:t>Prof.</w:t>
-            </w:r>
-            <w:r>
-              <w:rPr>
-                <w:rFonts w:ascii="Arial MT"/>
-                <w:spacing w:val="-3"/>
-                <w:sz w:val="24"/>
-              </w:rPr>
-              <w:t xml:space="preserve"> </w:t>
-            </w:r>
-            <w:r>
-              <w:rPr>
-                <w:rFonts w:ascii="Arial MT"/>
-                <w:sz w:val="24"/>
-              </w:rPr>
-              <w:t>Dr.</w:t>
-            </w:r>
-            <w:r>
-              <w:rPr>
-                <w:rFonts w:ascii="Arial MT"/>
-                <w:spacing w:val="-4"/>
-                <w:sz w:val="24"/>
-              </w:rPr>
-              <w:t xml:space="preserve"> </w:t>
-            </w:r>
-            <w:r>
-              <w:rPr>
-                <w:rFonts w:ascii="Arial MT"/>
-                <w:sz w:val="24"/>
-              </w:rPr>
-              <w:t>Zia</w:t>
-            </w:r>
-            <w:r>
-              <w:rPr>
-                <w:rFonts w:ascii="Arial MT"/>
-                <w:spacing w:val="-3"/>
-                <w:sz w:val="24"/>
-              </w:rPr>
-              <w:t xml:space="preserve"> </w:t>
-            </w:r>
-            <w:proofErr w:type="spellStart"/>
-            <w:r>
-              <w:rPr>
-                <w:rFonts w:ascii="Arial MT"/>
-                <w:sz w:val="24"/>
-              </w:rPr>
-              <w:t>ur</w:t>
-            </w:r>
-            <w:proofErr w:type="spellEnd"/>
-            <w:r>
-              <w:rPr>
-                <w:rFonts w:ascii="Arial MT"/>
-                <w:spacing w:val="-3"/>
-                <w:sz w:val="24"/>
-              </w:rPr>
-              <w:t xml:space="preserve"> </w:t>
-            </w:r>
-            <w:r>
-              <w:rPr>
-                <w:rFonts w:ascii="Arial MT"/>
-                <w:spacing w:val="-2"/>
-                <w:sz w:val="24"/>
-              </w:rPr>
-              <w:t>Rehman</w:t>
-            </w:r>
-          </w:p>
-        </w:tc>
-        <w:tc>
-          <w:tcPr>
-            <w:tcW w:w="4860" w:type="dxa"/>
-          </w:tcPr>
-          <w:p>
-            <w:pPr>
-              <w:pStyle w:val="TableParagraph"/>
-              <w:spacing w:before="120"/>
-              <w:ind w:left="109"/>
-              <w:rPr>
-                <w:rFonts w:ascii="Arial MT"/>
-                <w:sz w:val="24"/>
-              </w:rPr>
-            </w:pPr>
-            <w:r>
-              <w:rPr>
-                <w:position w:val="2"/>
-              </w:rPr>
-              <w:t>Name:</w:t>
-            </w:r>
-            <w:r>
-              <w:rPr>
-                <w:spacing w:val="16"/>
-                <w:position w:val="2"/>
-              </w:rPr>
-              <w:t xml:space="preserve"> </w:t>
-            </w:r>
-            <w:r>
-              <w:rPr>
-                <w:rFonts w:ascii="Arial MT"/>
-                <w:sz w:val="24"/>
-              </w:rPr>
-              <w:t>Prof.</w:t>
-            </w:r>
-            <w:r>
-              <w:rPr>
-                <w:rFonts w:ascii="Arial MT"/>
-                <w:spacing w:val="-4"/>
-                <w:sz w:val="24"/>
-              </w:rPr>
-              <w:t xml:space="preserve"> </w:t>
-            </w:r>
-            <w:r>
-              <w:rPr>
-                <w:rFonts w:ascii="Arial MT"/>
-                <w:sz w:val="24"/>
-              </w:rPr>
-              <w:t>Dr.</w:t>
-            </w:r>
-            <w:r>
-              <w:rPr>
-                <w:rFonts w:ascii="Arial MT"/>
-                <w:spacing w:val="-4"/>
-                <w:sz w:val="24"/>
-              </w:rPr>
-              <w:t xml:space="preserve"> </w:t>
-            </w:r>
-            <w:r>
-              <w:rPr>
-                <w:rFonts w:ascii="Arial MT"/>
-                <w:sz w:val="24"/>
-              </w:rPr>
-              <w:t>Nazir</w:t>
-            </w:r>
-            <w:r>
-              <w:rPr>
-                <w:rFonts w:ascii="Arial MT"/>
-                <w:spacing w:val="-4"/>
-                <w:sz w:val="24"/>
-              </w:rPr>
-              <w:t xml:space="preserve"> </w:t>
-            </w:r>
-            <w:r>
-              <w:rPr>
-                <w:rFonts w:ascii="Arial MT"/>
-                <w:sz w:val="24"/>
-              </w:rPr>
-              <w:t>Ahmad</w:t>
-            </w:r>
-            <w:r>
-              <w:rPr>
-                <w:rFonts w:ascii="Arial MT"/>
-                <w:spacing w:val="-3"/>
-                <w:sz w:val="24"/>
-              </w:rPr>
-              <w:t xml:space="preserve"> </w:t>
-            </w:r>
-            <w:r>
-              <w:rPr>
-                <w:rFonts w:ascii="Arial MT"/>
-                <w:spacing w:val="-2"/>
-                <w:sz w:val="24"/>
-              </w:rPr>
-              <w:t>Zafar</w:t>
-            </w:r>
-          </w:p>
-        </w:tc>
-      </w:tr>
-      <w:tr>
-        <w:trPr>
-          <w:trHeight w:val="508"/>
-        </w:trPr>
-        <w:tc>
-          <w:tcPr>
-            <w:tcW w:w="4663" w:type="dxa"/>
-          </w:tcPr>
-          <w:p>
-            <w:pPr>
-              <w:pStyle w:val="TableParagraph"/>
-              <w:spacing w:line="249" w:lineRule="exact"/>
-              <w:ind w:left="110"/>
-            </w:pPr>
-            <w:r>
-              <w:rPr>
-                <w:noProof/>
-              </w:rPr>
-              <mc:AlternateContent>
-                <mc:Choice Requires="wpg">
-                  <w:drawing>
-                    <wp:anchor distT="0" distB="0" distL="0" distR="0" simplePos="0" relativeHeight="251664384" behindDoc="1" locked="0" layoutInCell="1" allowOverlap="1" wp14:anchorId="2994DEB9" wp14:editId="4F31153B">
-                      <wp:simplePos x="0" y="0"/>
-                      <wp:positionH relativeFrom="column">
-                        <wp:posOffset>926726</wp:posOffset>
-                      </wp:positionH>
-                      <wp:positionV relativeFrom="paragraph">
-                        <wp:posOffset>-62474</wp:posOffset>
-                      </wp:positionV>
-                      <wp:extent cx="640080" cy="434975"/>
-                      <wp:effectExtent l="0" t="0" r="0" b="0"/>
-                      <wp:wrapNone/>
-                      <wp:docPr id="9" name="Group 9"/>
-                      <wp:cNvGraphicFramePr>
-                        <a:graphicFrameLocks xmlns:a="http://schemas.openxmlformats.org/drawingml/2006/main"/>
-                      </wp:cNvGraphicFramePr>
-                      <a:graphic xmlns:a="http://schemas.openxmlformats.org/drawingml/2006/main">
-                        <a:graphicData uri="http://schemas.microsoft.com/office/word/2010/wordprocessingGroup">
-                          <wpg:wgp>
-                            <wpg:cNvGrpSpPr>
-                              <a:grpSpLocks/>
-                            </wpg:cNvGrpSpPr>
-                            <wpg:grpSpPr>
-                              <a:xfrm>
-                                <a:off x="0" y="0"/>
-                                <a:ext cx="640080" cy="434975"/>
-                                <a:chOff x="0" y="0"/>
-                                <a:chExt cx="640080" cy="434975"/>
-                              </a:xfrm>
-                            </wpg:grpSpPr>
-                            <pic:pic xmlns:pic="http://schemas.openxmlformats.org/drawingml/2006/picture">
-                              <pic:nvPicPr>
-                                <pic:cNvPr id="10" name="Image 10"/>
-                                <pic:cNvPicPr/>
-                              </pic:nvPicPr>
-                              <pic:blipFill>
-                                <a:blip r:embed="rId17" cstate="print"/>
-                                <a:stretch>
-                                  <a:fillRect/>
-                                </a:stretch>
-                              </pic:blipFill>
-                              <pic:spPr>
-                                <a:xfrm>
-                                  <a:off x="0" y="0"/>
-                                  <a:ext cx="605725" cy="411480"/>
-                                </a:xfrm>
-                                <a:prstGeom prst="rect">
-                                  <a:avLst/>
-                                </a:prstGeom>
-                              </pic:spPr>
-                            </pic:pic>
-                          </wpg:wgp>
-                        </a:graphicData>
-                      </a:graphic>
-                    </wp:anchor>
-                  </w:drawing>
-                </mc:Choice>
-                <mc:Fallback>
-                  <w:pict>
-                    <v:group w14:anchorId="13942DC0" id="Group 9" o:spid="_x0000_s1026" style="position:absolute;margin-left:72.95pt;margin-top:-4.9pt;width:50.4pt;height:34.25pt;z-index:-251652096;mso-wrap-distance-left:0;mso-wrap-distance-right:0" coordsize="6400,4349" o:gfxdata="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">
-                      <v:shape id="Image 10" o:spid="_x0000_s1027" type="#_x0000_t75" style="position:absolute;width:6057;height:4114;visibility:visible;mso-wrap-style:square" o:gfxdata="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">
-                        <v:imagedata r:id="rId18" o:title=""/>
-                      </v:shape>
-                    </v:group>
-                  </w:pict>
-                </mc:Fallback>
-              </mc:AlternateContent>
-            </w:r>
-            <w:r>
-              <w:rPr>
-                <w:spacing w:val="-2"/>
-              </w:rPr>
-              <w:t>Signature:</w:t>
-            </w:r>
-          </w:p>
-        </w:tc>
-        <w:tc>
-          <w:tcPr>
-            <w:tcW w:w="4860" w:type="dxa"/>
-          </w:tcPr>
-          <w:p>
-            <w:pPr>
-              <w:pStyle w:val="TableParagraph"/>
-              <w:spacing w:line="249" w:lineRule="exact"/>
-              <w:ind w:left="109"/>
-            </w:pPr>
-            <w:r>
-              <w:rPr>
-                <w:spacing w:val="-2"/>
-              </w:rPr>
-              <w:t>Signature:</w:t>
-            </w:r>
-          </w:p>
-        </w:tc>
-      </w:tr>
-    </w:tbl>
-    <w:p/>
-    <w:p/>
-    <w:p>
-      <w:pPr>
-        <w:rPr>
-          <w:rFonts w:asciiTheme="majorBidi" w:hAnsiTheme="majorBidi" w:cstheme="majorBidi"/>
-          <w:b/>
-          <w:sz w:val="32"/>
-          <w:szCs w:val="32"/>
-        </w:rPr>
-        <w:sectPr>
-          <w:footerReference w:type="default" r:id="rId19"/>
-          <w:pgSz w:w="11906" w:h="16838"/>
-          <w:pgMar w:top="720" w:right="720" w:bottom="720" w:left="720" w:header="720" w:footer="720" w:gutter="0"/>
-          <w:cols w:space="720"/>
-          <w:titlePg/>
-          <w:docGrid w:linePitch="360"/>
-        </w:sectPr>
-      </w:pPr>
-    </w:p>
-    <w:p>
-      <w:pPr>
-        <w:spacing w:after="0" w:line="360" w:lineRule="auto"/>
-        <w:jc w:val="center"/>
-        <w:rPr>
-          <w:rFonts w:asciiTheme="majorBidi" w:hAnsiTheme="majorBidi" w:cstheme="majorBidi"/>
-          <w:b/>
-          <w:sz w:val="32"/>
-          <w:szCs w:val="32"/>
-        </w:rPr>
-      </w:pPr>
-    </w:p>
-    <w:p>
-      <w:pPr>
         <w:spacing w:after="0" w:line="360" w:lineRule="auto"/>
         <w:jc w:val="center"/>
         <w:rPr>
@@ -3057,7 +19,6 @@
           <w:sz w:val="32"/>
           <w:szCs w:val="32"/>
         </w:rPr>
-        <w:lastRenderedPageBreak/>
         <w:drawing>
           <wp:anchor distT="0" distB="0" distL="0" distR="0" simplePos="0" relativeHeight="251659264" behindDoc="0" locked="0" layoutInCell="1" allowOverlap="1" wp14:anchorId="3AF8BD02" wp14:editId="2CF19D99">
             <wp:simplePos x="0" y="0"/>
@@ -3082,7 +43,7 @@
                     <pic:cNvPicPr/>
                   </pic:nvPicPr>
                   <pic:blipFill>
-                    <a:blip r:embed="rId20" cstate="print"/>
+                    <a:blip r:embed="rId8" cstate="print"/>
                     <a:stretch>
                       <a:fillRect/>
                     </a:stretch>
@@ -3211,8 +172,8 @@
         <w:tblLook w:val="01E0" w:firstRow="1" w:lastRow="1" w:firstColumn="1" w:lastColumn="1" w:noHBand="0" w:noVBand="0"/>
       </w:tblPr>
       <w:tblGrid>
-        <w:gridCol w:w="5038"/>
-        <w:gridCol w:w="4755"/>
+        <w:gridCol w:w="4253"/>
+        <w:gridCol w:w="5540"/>
       </w:tblGrid>
       <w:tr>
         <w:trPr>
@@ -3220,7 +181,7 @@
         </w:trPr>
         <w:tc>
           <w:tcPr>
-            <w:tcW w:w="5038" w:type="dxa"/>
+            <w:tcW w:w="4253" w:type="dxa"/>
             <w:tcBorders>
               <w:top w:val="single" w:sz="4" w:space="0" w:color="auto"/>
               <w:left w:val="single" w:sz="4" w:space="0" w:color="auto"/>
@@ -3265,7 +226,7 @@
         </w:tc>
         <w:tc>
           <w:tcPr>
-            <w:tcW w:w="4755" w:type="dxa"/>
+            <w:tcW w:w="5540" w:type="dxa"/>
             <w:tcBorders>
               <w:left w:val="single" w:sz="4" w:space="0" w:color="auto"/>
             </w:tcBorders>
@@ -3358,7 +319,7 @@
         </w:trPr>
         <w:tc>
           <w:tcPr>
-            <w:tcW w:w="5038" w:type="dxa"/>
+            <w:tcW w:w="4253" w:type="dxa"/>
             <w:tcBorders>
               <w:top w:val="single" w:sz="4" w:space="0" w:color="auto"/>
             </w:tcBorders>
@@ -3410,7 +371,7 @@
         </w:tc>
         <w:tc>
           <w:tcPr>
-            <w:tcW w:w="4755" w:type="dxa"/>
+            <w:tcW w:w="5540" w:type="dxa"/>
           </w:tcPr>
           <w:p>
             <w:pPr>
@@ -3508,7 +469,7 @@
         </w:trPr>
         <w:tc>
           <w:tcPr>
-            <w:tcW w:w="5038" w:type="dxa"/>
+            <w:tcW w:w="4253" w:type="dxa"/>
           </w:tcPr>
           <w:p>
             <w:pPr>
@@ -3547,7 +508,7 @@
         </w:tc>
         <w:tc>
           <w:tcPr>
-            <w:tcW w:w="4755" w:type="dxa"/>
+            <w:tcW w:w="5540" w:type="dxa"/>
           </w:tcPr>
           <w:p>
             <w:pPr>
@@ -3591,7 +552,7 @@
         </w:trPr>
         <w:tc>
           <w:tcPr>
-            <w:tcW w:w="5038" w:type="dxa"/>
+            <w:tcW w:w="4253" w:type="dxa"/>
           </w:tcPr>
           <w:p>
             <w:pPr>
@@ -3688,7 +649,7 @@
         </w:tc>
         <w:tc>
           <w:tcPr>
-            <w:tcW w:w="4755" w:type="dxa"/>
+            <w:tcW w:w="5540" w:type="dxa"/>
           </w:tcPr>
           <w:p>
             <w:pPr>
@@ -4050,7 +1011,7 @@
         </w:trPr>
         <w:tc>
           <w:tcPr>
-            <w:tcW w:w="5038" w:type="dxa"/>
+            <w:tcW w:w="4253" w:type="dxa"/>
           </w:tcPr>
           <w:p>
             <w:pPr>
@@ -4127,7 +1088,7 @@
         </w:tc>
         <w:tc>
           <w:tcPr>
-            <w:tcW w:w="4755" w:type="dxa"/>
+            <w:tcW w:w="5540" w:type="dxa"/>
           </w:tcPr>
           <w:p>
             <w:pPr>
@@ -4162,7 +1123,7 @@
         </w:trPr>
         <w:tc>
           <w:tcPr>
-            <w:tcW w:w="5038" w:type="dxa"/>
+            <w:tcW w:w="4253" w:type="dxa"/>
           </w:tcPr>
           <w:p>
             <w:pPr>
@@ -4194,7 +1155,7 @@
         </w:tc>
         <w:tc>
           <w:tcPr>
-            <w:tcW w:w="4755" w:type="dxa"/>
+            <w:tcW w:w="5540" w:type="dxa"/>
           </w:tcPr>
           <w:p>
             <w:pPr>
@@ -4226,7 +1187,7 @@
         </w:trPr>
         <w:tc>
           <w:tcPr>
-            <w:tcW w:w="5038" w:type="dxa"/>
+            <w:tcW w:w="4253" w:type="dxa"/>
           </w:tcPr>
           <w:p>
             <w:pPr>
@@ -4284,7 +1245,7 @@
         </w:tc>
         <w:tc>
           <w:tcPr>
-            <w:tcW w:w="4755" w:type="dxa"/>
+            <w:tcW w:w="5540" w:type="dxa"/>
           </w:tcPr>
           <w:p>
             <w:pPr>
@@ -4323,7 +1284,7 @@
         </w:trPr>
         <w:tc>
           <w:tcPr>
-            <w:tcW w:w="5038" w:type="dxa"/>
+            <w:tcW w:w="4253" w:type="dxa"/>
           </w:tcPr>
           <w:p>
             <w:pPr>
@@ -4347,7 +1308,7 @@
         </w:tc>
         <w:tc>
           <w:tcPr>
-            <w:tcW w:w="4755" w:type="dxa"/>
+            <w:tcW w:w="5540" w:type="dxa"/>
           </w:tcPr>
           <w:p>
             <w:pPr>
@@ -4379,7 +1340,7 @@
         </w:trPr>
         <w:tc>
           <w:tcPr>
-            <w:tcW w:w="5038" w:type="dxa"/>
+            <w:tcW w:w="4253" w:type="dxa"/>
           </w:tcPr>
           <w:p>
             <w:pPr>
@@ -4421,7 +1382,7 @@
         </w:tc>
         <w:tc>
           <w:tcPr>
-            <w:tcW w:w="4755" w:type="dxa"/>
+            <w:tcW w:w="5540" w:type="dxa"/>
           </w:tcPr>
           <w:p>
             <w:pPr>
@@ -4491,7 +1452,7 @@
                     <pic:cNvPicPr/>
                   </pic:nvPicPr>
                   <pic:blipFill rotWithShape="1">
-                    <a:blip r:embed="rId21"/>
+                    <a:blip r:embed="rId9"/>
                     <a:srcRect l="8774" r="33992" b="26592"/>
                     <a:stretch>
                       <a:fillRect/>
@@ -4636,7 +1597,6 @@
           <w:sz w:val="24"/>
           <w:szCs w:val="24"/>
         </w:rPr>
-        <w:lastRenderedPageBreak/>
         <w:t>Summary of the Research</w:t>
       </w:r>
     </w:p>
@@ -4644,41 +1604,54 @@
       <w:pPr>
         <w:spacing w:after="160" w:line="360" w:lineRule="auto"/>
         <w:jc w:val="both"/>
+        <w:rPr>
+          <w:rFonts w:ascii="Times New Roman" w:hAnsi="Times New Roman"/>
+          <w:sz w:val="24"/>
+        </w:rPr>
       </w:pPr>
       <w:r>
         <w:rPr>
           <w:rFonts w:ascii="Times New Roman" w:hAnsi="Times New Roman"/>
-          <w:b w:val="0"/>
-          <w:sz w:val="24"/>
-        </w:rPr>
-        <w:t>Multi-UAV coordination using deep reinforcement learning has advanced significantly, yet a structural and documented gap persists: target assignment and collision avoidance are not independent decisions, and no existing framework addresses the coupling between them. The two most advanced contributions to these sub-problems — DA-MAPPO (Sheng et al., 2026) for target assignment and IGAT-MARL (Rezaee et al., 2026) for collision avoidance — were developed independently, each tested in two-dimensional environments with at most ten drones, and each explicitly identifies the other paper's contribution as its own future work. DA-MAPPO demonstrated that embedding real-time Hungarian-algorithm-based target assignments into each drone's observation vector is the sole mechanism responsible for successful navigation: its own ablation study shows 0% mission success when this assignment information is removed. IGAT-MARL demonstrated that sparse conflict-aware interaction graphs, which connect only drone pairs on a predicted collision course, reduce unnecessary communication by 44% while improving avoidance performance. This research proposes a unified MAPPO-based framework that integrates both mechanisms in a single policy trained in a 3D simulation environment. The central research problem is the structural coupling between these two objectives: the path each drone takes toward its assigned target determines its proximity to other agents, while any collision-driven course deviation changes which assignment that drone can still complete. In three dimensions, where altitude introduces vertical collision courses absent from planar environments, this coupling creates coordination failures — a single evasive maneuver can cascade into reassignment conflicts across the swarm — that neither framework alone can resolve. The proposed framework encodes both assignment state and conflict neighborhood in each drone's observation, and introduces a Priority Arbitration Head — a lightweight feedforward module jointly trained with the MAPPO actor — that takes time-to-collision, distance to the assigned target, and conflict neighborhood count as inputs and outputs a dynamic weight α at each decision step, applied as: r_total = α × r_assignment + (1−α) × r_avoidance. Unlike DA-MAPPO and IGAT-MARL, which both apply fixed reward coefficients throughout training, the Priority Arbitration Head learns when evasion must override assignment and when assignment can safely dominate — making it the first mechanism to resolve the assignment–avoidance tension within a single coordinated decision. The framework is trained via curriculum learning from 3 to 8 drones with progressive obstacle density. Evaluation will compare the learned arbitration weight against fixed-coefficient baselines (α = 0.3, 0.5, 0.7) and prior frameworks across three swarm sizes and three obstacle densities, yielding the first empirical answer to whether a dynamically arbitrated policy outperforms fixed-weight approaches in maintaining both mission success and collision safety under three-dimensional dynamic conditions.</w:t>
+          <w:sz w:val="24"/>
+        </w:rPr>
+        <w:t>Multi-UAV coordination using deep reinforcement learning has advanced significantly, yet a structural and documented gap persists: target assignment and collision avoidance are not independent decisions, and no existing framework addresses the coupling between them. The two most advanced contributions to these sub-problems — DA-MAPPO (Sheng et al., 2026) for target assignment and IGAT-MARL (Rezaee et al., 2026) for collision avoidance — were developed independently, each tested in two-dimensional environments with at most ten drones, and each explicitly identifies the other paper's contribution as its own future work. DA-MAPPO demonstrated that embedding real-time Hungarian-algorithm-based target assignments into each drone's observation vector is the sole mechanism responsible for successful navigation: its own ablation study shows 0% mission success when this assignment information is removed. IGAT-MARL demonstrated that sparse conflict-aware interaction graphs, which connect only drone pairs on a predicted collision course, reduce unnecessary communication by 44% while improving avoidance performance. This research proposes a unified MAPPO-based framework that integrates both mechanisms in a single policy trained in a 3D simulation environment. The central research problem is the structural coupling between these two objectives: the path each drone takes toward its assigned target determines its proximity to other agents, while any collision-driven course deviation changes which assignment that drone can still complete. In three dimensions, where altitude introduces vertical collision courses absent from planar environments, this coupling creates coordination failures — a single evasive maneuver can cascade into reassignment conflicts across the swarm — that neither framework alone can resolve. The proposed framework encodes both assignment state and conflict neighborhood in each drone's observation, trained via curriculum learning from 3 to 8 drones with progressive obstacle density. Evaluation will compare against four controlled baselines across three swarm sizes and three obstacle densities, yielding the first empirical answer to whether joint encoding of both constraints enables a unified policy to maintain high-value target coverage and collision-free operation under dynamic conditions.</w:t>
       </w:r>
-      <w:r>
+    </w:p>
+    <w:p>
+      <w:pPr>
+        <w:spacing w:after="160" w:line="360" w:lineRule="auto"/>
+        <w:jc w:val="both"/>
         <w:rPr>
           <w:rFonts w:ascii="Times New Roman" w:hAnsi="Times New Roman"/>
           <w:sz w:val="24"/>
         </w:rPr>
-      </w:r>
-      <w:r>
+      </w:pPr>
+    </w:p>
+    <w:p>
+      <w:pPr>
+        <w:spacing w:after="160" w:line="360" w:lineRule="auto"/>
+        <w:jc w:val="both"/>
         <w:rPr>
           <w:rFonts w:ascii="Times New Roman" w:hAnsi="Times New Roman"/>
           <w:sz w:val="24"/>
         </w:rPr>
-      </w:r>
-      <w:r>
-        <w:rPr>
-          <w:rFonts w:asciiTheme="majorBidi" w:hAnsiTheme="majorBidi" w:cstheme="majorBidi"/>
-          <w:sz w:val="24"/>
-          <w:szCs w:val="24"/>
-        </w:rPr>
-      </w:r>
-      <w:r>
-        <w:rPr>
-          <w:rFonts w:asciiTheme="majorBidi" w:hAnsiTheme="majorBidi" w:cstheme="majorBidi"/>
-          <w:sz w:val="24"/>
-          <w:szCs w:val="24"/>
-        </w:rPr>
-      </w:r>
+      </w:pPr>
+    </w:p>
+    <w:p>
+      <w:pPr>
+        <w:spacing w:after="160" w:line="360" w:lineRule="auto"/>
+        <w:jc w:val="both"/>
+        <w:rPr>
+          <w:rFonts w:ascii="Times New Roman" w:hAnsi="Times New Roman"/>
+          <w:sz w:val="24"/>
+        </w:rPr>
+      </w:pPr>
+    </w:p>
+    <w:p>
+      <w:pPr>
+        <w:spacing w:after="160" w:line="360" w:lineRule="auto"/>
+        <w:jc w:val="both"/>
+      </w:pPr>
     </w:p>
     <w:p>
       <w:pPr>
@@ -4702,7 +1675,6 @@
           <w:sz w:val="24"/>
           <w:szCs w:val="24"/>
         </w:rPr>
-        <w:lastRenderedPageBreak/>
         <w:t>Introduction</w:t>
       </w:r>
     </w:p>
@@ -4783,16 +1755,8 @@
           <w:sz w:val="24"/>
           <w:szCs w:val="24"/>
         </w:rPr>
-        <w:t xml:space="preserve">There has been, however, a patchwork approach to progress in this area. Researchers who investigated ways of assigning targets to drones in real time did not account for </w:t>
-      </w:r>
-      <w:r>
-        <w:rPr>
-          <w:rFonts w:asciiTheme="majorBidi" w:hAnsiTheme="majorBidi" w:cstheme="majorBidi"/>
-          <w:sz w:val="24"/>
-          <w:szCs w:val="24"/>
-        </w:rPr>
         <w:lastRenderedPageBreak/>
-        <w:t>collisions between teammates while developing their methods. The researchers investigated obstacle avoidance and avoidance between drones during flight but did not include any goal structure; their drones were not required to reach any target, only another drone to avoid. Work done in the large-scale environment worked in two dimensions. What you get are a set of partial and competent solutions, none of which solve all parts of the coordination problem, and each of which makes the other parts either trivial or dealt with separately.</w:t>
+        <w:t>There has been, however, a patchwork approach to progress in this area. Researchers who investigated ways of assigning targets to drones in real time did not account for collisions between teammates while developing their methods. The researchers investigated obstacle avoidance and avoidance between drones during flight but did not include any goal structure; their drones were not required to reach any target, only another drone to avoid. Work done in the large-scale environment worked in two dimensions. What you get are a set of partial and competent solutions, none of which solve all parts of the coordination problem, and each of which makes the other parts either trivial or dealt with separately.</w:t>
       </w:r>
     </w:p>
     <w:p>
@@ -4809,7 +1773,6 @@
       <w:r>
         <w:rPr>
           <w:rFonts w:asciiTheme="majorBidi" w:hAnsiTheme="majorBidi" w:cstheme="majorBidi"/>
-          <w:b w:val="0"/>
           <w:sz w:val="24"/>
           <w:szCs w:val="24"/>
         </w:rPr>
@@ -4868,7 +1831,16 @@
           <w:sz w:val="24"/>
           <w:szCs w:val="24"/>
         </w:rPr>
-        <w:t xml:space="preserve"> et al. [12] were the first to show that a convolutional neural network, trained using Q-learning, could attain human performance level on Atari games, directly from pixel inputs. Later improvements fixed important instabilities: Van Hasselt et al. [13] proposed Double DQN for systematic overestimation of the value of actions; Wang et al. [14] introduced Dueling Network architecture, which learned two networks to estimate state values and action advantages, which proved useful when the choice of action was less important in the state; and Schaul et al. [15] introduced Prioritized Experience Replay, which sampled training transitions according to the temporal difference error, thus speeding up learning from rare but informative transitions. Tang et al. [1] employ the Improved D3QN architecture for dynamic scene navigation with a single UAV, which is built on these four contributions.</w:t>
+        <w:t xml:space="preserve"> et al. [12] were the first to show that a convolutional neural network, trained using Q-learning, could attain human performance level on Atari games, directly from pixel inputs. Later improvements fixed important instabilities: Van Hasselt et al. [13] proposed Double DQN for systematic overestimation of the value of actions; Wang et al. [14] introduced Dueling Network architecture, which learned two networks to estimate state values and action advantages, which proved useful when the choice of action was less important in the state; and Schaul et al. [15] introduced Prioritized Experience Replay, which sampled training transitions according to the temporal difference error, thus speeding up learning from rare but informative transitions. Tang </w:t>
+      </w:r>
+      <w:r>
+        <w:rPr>
+          <w:rFonts w:asciiTheme="majorBidi" w:hAnsiTheme="majorBidi" w:cstheme="majorBidi"/>
+          <w:sz w:val="24"/>
+          <w:szCs w:val="24"/>
+        </w:rPr>
+        <w:lastRenderedPageBreak/>
+        <w:t>et al. [1] employ the Improved D3QN architecture for dynamic scene navigation with a single UAV, which is built on these four contributions.</w:t>
       </w:r>
     </w:p>
     <w:p>
@@ -4888,16 +1860,7 @@
           <w:sz w:val="24"/>
           <w:szCs w:val="24"/>
         </w:rPr>
-        <w:t xml:space="preserve">Policy gradient methods were another approach that naturally worked with continuous action spaces. A different approach was proposed by Schulman et al. [16] where Proximal Policy Optimization (PPO) limits the size of the policy updates using a clipped surrogate objective, which eliminates the need to use trust-region constraints </w:t>
-      </w:r>
-      <w:r>
-        <w:rPr>
-          <w:rFonts w:asciiTheme="majorBidi" w:hAnsiTheme="majorBidi" w:cstheme="majorBidi"/>
-          <w:sz w:val="24"/>
-          <w:szCs w:val="24"/>
-        </w:rPr>
-        <w:lastRenderedPageBreak/>
-        <w:t>while maintaining training stability. PPO was made the baseline single-agent algorithm for comparison with cooperative MARL algorithms. To correct for overestimation of continuous-action actor-critic methods, Fujimoto et al. [18] introduced Twin Delayed Deep Deterministic Policy Gradient (TD3), which used clipped double Q learning, delayed policy updates and target policy smoothing. The policy backbone of the multi-UAV target assignment was chosen as TD3, adopted by Kong et al. [2] for its stability in continuous control.</w:t>
+        <w:t>Policy gradient methods were another approach that naturally worked with continuous action spaces. A different approach was proposed by Schulman et al. [16] where Proximal Policy Optimization (PPO) limits the size of the policy updates using a clipped surrogate objective, which eliminates the need to use trust-region constraints while maintaining training stability. PPO was made the baseline single-agent algorithm for comparison with cooperative MARL algorithms. To correct for overestimation of continuous-action actor-critic methods, Fujimoto et al. [18] introduced Twin Delayed Deep Deterministic Policy Gradient (TD3), which used clipped double Q learning, delayed policy updates and target policy smoothing. The policy backbone of the multi-UAV target assignment was chosen as TD3, adopted by Kong et al. [2] for its stability in continuous control.</w:t>
       </w:r>
     </w:p>
     <w:p>
@@ -4955,7 +1918,16 @@
           <w:sz w:val="24"/>
           <w:szCs w:val="24"/>
         </w:rPr>
-        <w:t xml:space="preserve">Surveys of DRL for autonomous systems have given systematic overviews of progress regarding sub-domains. Govinda et al. [11] reviewed the applications in transportation, robotics, and UAV systems and found the lack of common frameworks that combine both navigation efficiency and inter-agent coordination as a prevailing drawback. Aggarwal and Kumar [23] introduced a review of path planning methods particularly for UAVs that summarizes failure cases of common path planning algorithms in dynamic environments and identifies DRL as the most promising approach for real-time adaptive path planning. Most UAV coordination problems that are formulated by MARLs are formulated in a formal framework called decentralized partially observable Markov decision process (Dec-POMDPs), introduced by Oliehoek and Amato [24]. </w:t>
+        <w:t xml:space="preserve">Surveys of DRL for autonomous systems have given systematic overviews of progress regarding sub-domains. Govinda et al. [11] reviewed the applications in transportation, robotics, and UAV systems and found the lack of common frameworks that combine </w:t>
+      </w:r>
+      <w:r>
+        <w:rPr>
+          <w:rFonts w:asciiTheme="majorBidi" w:hAnsiTheme="majorBidi" w:cstheme="majorBidi"/>
+          <w:sz w:val="24"/>
+          <w:szCs w:val="24"/>
+        </w:rPr>
+        <w:lastRenderedPageBreak/>
+        <w:t xml:space="preserve">both navigation efficiency and inter-agent coordination as a prevailing drawback. Aggarwal and Kumar [23] introduced a review of path planning methods particularly for UAVs that summarizes failure cases of common path planning algorithms in dynamic environments and identifies DRL as the most promising approach for real-time adaptive path planning. Most UAV coordination problems that are formulated by MARLs are formulated in a formal framework called decentralized partially observable Markov decision process (Dec-POMDPs), introduced by Oliehoek and Amato [24]. </w:t>
       </w:r>
       <w:proofErr w:type="spellStart"/>
       <w:r>
@@ -4964,7 +1936,6 @@
           <w:sz w:val="24"/>
           <w:szCs w:val="24"/>
         </w:rPr>
-        <w:lastRenderedPageBreak/>
         <w:t>Gronauer</w:t>
       </w:r>
       <w:proofErr w:type="spellEnd"/>
@@ -5052,6 +2023,7 @@
           <w:sz w:val="24"/>
           <w:szCs w:val="24"/>
         </w:rPr>
+        <w:lastRenderedPageBreak/>
         <w:t xml:space="preserve">The most closely related work to this research is DA-MAPPO (Sheng et al. [10]), which introduces real-time Hungarian-algorithm-based target assignments directly into each drone's observation vector, and updates it at each decision step. The paper's ablation study of mission success is fascinating: there is a dramatic decline in mission success going from over 90% to 0%, directly confirming that the mechanism </w:t>
       </w:r>
       <w:r>
@@ -5068,16 +2040,7 @@
           <w:sz w:val="24"/>
           <w:szCs w:val="24"/>
         </w:rPr>
-        <w:t xml:space="preserve"> than the policy design is responsible for the success of the framework. The authors explicitly mention 3D extension and larger swarms as future work and DA-MAPPO was </w:t>
-      </w:r>
-      <w:r>
-        <w:rPr>
-          <w:rFonts w:asciiTheme="majorBidi" w:hAnsiTheme="majorBidi" w:cstheme="majorBidi"/>
-          <w:sz w:val="24"/>
-          <w:szCs w:val="24"/>
-        </w:rPr>
-        <w:lastRenderedPageBreak/>
-        <w:t>evaluated on three drones in a 2D space with static obstacles. There is a known failure in the absence of a collision-avoidance mechanism other than a reward for avoiding collision.</w:t>
+        <w:t xml:space="preserve"> than the policy design is responsible for the success of the framework. The authors explicitly mention 3D extension and larger swarms as future work and DA-MAPPO was evaluated on three drones in a 2D space with static obstacles. There is a known failure in the absence of a collision-avoidance mechanism other than a reward for avoiding collision.</w:t>
       </w:r>
     </w:p>
     <w:p>
@@ -5117,7 +2080,16 @@
           <w:sz w:val="24"/>
           <w:szCs w:val="24"/>
         </w:rPr>
-        <w:t>There has been recent research on the use of LLMs in UAV coordination. To tackle the issues associated with cold-start in MARL training, Xu et al. [6] proposed a novel approach that employs GPT-4o to offer strategic relay position initialization for UAV multi-hop networking. Wang et al. [7] presented a two-stage approach RALLY that employs LLM semantic consensus to assign Commander, Coordinator and Executor roles for drones and then further optimizes coordination via an RMIX value-mixing network. Poudel and Moh [5] discussed the problem of heterogeneous drone fleets in disaster scenarios where MAML is used to rapidly adapt to unseen environments with resource-aware coalition formation. Khan et al. [8] offered a systematic review of multi-agent coordination frameworks based on LLMs. These have pushed the limits of multi-agent coordination but none of them studied the interaction between dynamic target assignment and collision avoidance in 3D space which is the focus of this work.</w:t>
+        <w:t xml:space="preserve">There has been recent research on the use of LLMs in UAV coordination. To tackle the issues associated with cold-start in MARL training, Xu et al. [6] proposed a novel approach that employs GPT-4o to offer strategic relay position initialization for UAV multi-hop networking. Wang et al. [7] presented a two-stage approach RALLY that employs LLM semantic consensus to assign Commander, Coordinator and Executor roles for drones and then further optimizes coordination via an RMIX value-mixing network. Poudel and Moh [5] discussed the problem of heterogeneous drone fleets in disaster scenarios where MAML is used to rapidly adapt to unseen environments with resource-aware coalition formation. Khan et al. [8] offered a systematic review of multi-agent coordination frameworks based on LLMs. These have pushed the limits of </w:t>
+      </w:r>
+      <w:r>
+        <w:rPr>
+          <w:rFonts w:asciiTheme="majorBidi" w:hAnsiTheme="majorBidi" w:cstheme="majorBidi"/>
+          <w:sz w:val="24"/>
+          <w:szCs w:val="24"/>
+        </w:rPr>
+        <w:lastRenderedPageBreak/>
+        <w:t>multi-agent coordination but none of them studied the interaction between dynamic target assignment and collision avoidance in 3D space which is the focus of this work.</w:t>
       </w:r>
     </w:p>
     <w:p>
@@ -5134,30 +2106,10 @@
       <w:r>
         <w:rPr>
           <w:rFonts w:asciiTheme="majorBidi" w:hAnsiTheme="majorBidi" w:cstheme="majorBidi"/>
-          <w:b w:val="0"/>
           <w:sz w:val="24"/>
           <w:szCs w:val="24"/>
         </w:rPr>
         <w:t>The literature, when taken together, shows that no structural solution has been proposed for the coupling between target assignment and collision avoidance in a unified policy. DA-MAPPO and IGAT-MARL each handle one side while leaving the other unmodeled, and both cite the other paper's contribution as future work. No framework accounts for how assignment decisions shape each drone's spatial behavior and how safety-driven course deviations feed back into assignment feasibility — particularly in three-dimensional space where this coupling becomes structurally significant. It is this gap that the proposed research targets. Table 1 below gives a summary of all the reviewed studies.</w:t>
-      </w:r>
-      <w:r>
-        <w:rPr>
-          <w:rFonts w:asciiTheme="majorBidi" w:hAnsiTheme="majorBidi" w:cstheme="majorBidi"/>
-          <w:sz w:val="24"/>
-          <w:szCs w:val="24"/>
-        </w:rPr>
-      </w:r>
-      <w:r>
-        <w:rPr>
-          <w:rFonts w:asciiTheme="majorBidi" w:hAnsiTheme="majorBidi" w:cstheme="majorBidi"/>
-          <w:sz w:val="24"/>
-          <w:szCs w:val="24"/>
-        </w:rPr>
-      </w:r>
-      <w:r>
-        <w:rPr>
-          <w:rFonts w:asciiTheme="majorBidi" w:hAnsiTheme="majorBidi" w:cstheme="majorBidi"/>
-        </w:rPr>
       </w:r>
     </w:p>
     <w:p>
@@ -5883,6 +2835,7 @@
                 <w:sz w:val="24"/>
                 <w:szCs w:val="24"/>
               </w:rPr>
+              <w:lastRenderedPageBreak/>
               <w:t>[25]</w:t>
             </w:r>
           </w:p>
@@ -6063,16 +3016,7 @@
                 <w:sz w:val="24"/>
                 <w:szCs w:val="24"/>
               </w:rPr>
-              <w:t xml:space="preserve">Improved D3QN: Dueling Double DQN + Prioritized Experience Replay </w:t>
-            </w:r>
-            <w:r>
-              <w:rPr>
-                <w:rFonts w:asciiTheme="majorBidi" w:hAnsiTheme="majorBidi" w:cstheme="majorBidi"/>
-                <w:sz w:val="24"/>
-                <w:szCs w:val="24"/>
-              </w:rPr>
-              <w:lastRenderedPageBreak/>
-              <w:t>+ heuristic action bias toward target</w:t>
+              <w:t>Improved D3QN: Dueling Double DQN + Prioritized Experience Replay + heuristic action bias toward target</w:t>
             </w:r>
           </w:p>
         </w:tc>
@@ -6094,17 +3038,7 @@
                 <w:sz w:val="24"/>
                 <w:szCs w:val="24"/>
               </w:rPr>
-              <w:lastRenderedPageBreak/>
-              <w:t xml:space="preserve">Custom 2D grid sim; single UAV; static &amp; </w:t>
-            </w:r>
-            <w:r>
-              <w:rPr>
-                <w:rFonts w:asciiTheme="majorBidi" w:hAnsiTheme="majorBidi" w:cstheme="majorBidi"/>
-                <w:sz w:val="24"/>
-                <w:szCs w:val="24"/>
-              </w:rPr>
-              <w:lastRenderedPageBreak/>
-              <w:t>moving obstacles</w:t>
+              <w:t>Custom 2D grid sim; single UAV; static &amp; moving obstacles</w:t>
             </w:r>
           </w:p>
         </w:tc>
@@ -6126,7 +3060,6 @@
                 <w:sz w:val="24"/>
                 <w:szCs w:val="24"/>
               </w:rPr>
-              <w:lastRenderedPageBreak/>
               <w:t>Handles moving obstacles; PER speeds convergence; outperforms A* and RRT on path quality</w:t>
             </w:r>
           </w:p>
@@ -6149,16 +3082,7 @@
                 <w:sz w:val="24"/>
                 <w:szCs w:val="24"/>
               </w:rPr>
-              <w:t xml:space="preserve">Single drone only; 2D; discrete 8-direction actions; no </w:t>
-            </w:r>
-            <w:r>
-              <w:rPr>
-                <w:rFonts w:asciiTheme="majorBidi" w:hAnsiTheme="majorBidi" w:cstheme="majorBidi"/>
-                <w:sz w:val="24"/>
-                <w:szCs w:val="24"/>
-              </w:rPr>
-              <w:lastRenderedPageBreak/>
-              <w:t>hardware validation</w:t>
+              <w:t>Single drone only; 2D; discrete 8-direction actions; no hardware validation</w:t>
             </w:r>
           </w:p>
         </w:tc>
@@ -6184,7 +3108,6 @@
                 <w:sz w:val="24"/>
                 <w:szCs w:val="24"/>
               </w:rPr>
-              <w:lastRenderedPageBreak/>
               <w:t>[2]</w:t>
             </w:r>
           </w:p>
@@ -6811,6 +3734,7 @@
                 <w:sz w:val="24"/>
                 <w:szCs w:val="24"/>
               </w:rPr>
+              <w:lastRenderedPageBreak/>
               <w:t>[6]</w:t>
             </w:r>
           </w:p>
@@ -6991,16 +3915,7 @@
                 <w:sz w:val="24"/>
                 <w:szCs w:val="24"/>
               </w:rPr>
-              <w:t xml:space="preserve">RALLY: Two-stage LLM semantic consensus + RMIX role-value mixing </w:t>
-            </w:r>
-            <w:r>
-              <w:rPr>
-                <w:rFonts w:asciiTheme="majorBidi" w:hAnsiTheme="majorBidi" w:cstheme="majorBidi"/>
-                <w:sz w:val="24"/>
-                <w:szCs w:val="24"/>
-              </w:rPr>
-              <w:lastRenderedPageBreak/>
-              <w:t>(Commander/Coordinator/Executor); GPT-4o seeding; Qwen2.5-1.5B fine-tuned</w:t>
+              <w:t>RALLY: Two-stage LLM semantic consensus + RMIX role-value mixing (Commander/Coordinator/Executor); GPT-4o seeding; Qwen2.5-1.5B fine-tuned</w:t>
             </w:r>
           </w:p>
         </w:tc>
@@ -7022,17 +3937,7 @@
                 <w:sz w:val="24"/>
                 <w:szCs w:val="24"/>
               </w:rPr>
-              <w:lastRenderedPageBreak/>
-              <w:t>Multi-Agent Particle Environment (MPE); 8–11 drones; DS-</w:t>
-            </w:r>
-            <w:r>
-              <w:rPr>
-                <w:rFonts w:asciiTheme="majorBidi" w:hAnsiTheme="majorBidi" w:cstheme="majorBidi"/>
-                <w:sz w:val="24"/>
-                <w:szCs w:val="24"/>
-              </w:rPr>
-              <w:lastRenderedPageBreak/>
-              <w:t>CEFC task; one adversary drone</w:t>
+              <w:t>Multi-Agent Particle Environment (MPE); 8–11 drones; DS-CEFC task; one adversary drone</w:t>
             </w:r>
           </w:p>
         </w:tc>
@@ -7054,17 +3959,7 @@
                 <w:sz w:val="24"/>
                 <w:szCs w:val="24"/>
               </w:rPr>
-              <w:lastRenderedPageBreak/>
-              <w:t xml:space="preserve">Generalizes to unseen swarm sizes without retraining; theoretical proof; end-to-end </w:t>
-            </w:r>
-            <w:r>
-              <w:rPr>
-                <w:rFonts w:asciiTheme="majorBidi" w:hAnsiTheme="majorBidi" w:cstheme="majorBidi"/>
-                <w:sz w:val="24"/>
-                <w:szCs w:val="24"/>
-              </w:rPr>
-              <w:lastRenderedPageBreak/>
-              <w:t>deployment pipeline under 5 GB</w:t>
+              <w:t>Generalizes to unseen swarm sizes without retraining; theoretical proof; end-to-end deployment pipeline under 5 GB</w:t>
             </w:r>
           </w:p>
         </w:tc>
@@ -7086,17 +3981,7 @@
                 <w:sz w:val="24"/>
                 <w:szCs w:val="24"/>
               </w:rPr>
-              <w:lastRenderedPageBreak/>
-              <w:t xml:space="preserve">14.48s inference latency; qualitative SITL validation only; no real hardware; </w:t>
-            </w:r>
-            <w:r>
-              <w:rPr>
-                <w:rFonts w:asciiTheme="majorBidi" w:hAnsiTheme="majorBidi" w:cstheme="majorBidi"/>
-                <w:sz w:val="24"/>
-                <w:szCs w:val="24"/>
-              </w:rPr>
-              <w:lastRenderedPageBreak/>
-              <w:t>no historical memory</w:t>
+              <w:t>14.48s inference latency; qualitative SITL validation only; no real hardware; no historical memory</w:t>
             </w:r>
           </w:p>
         </w:tc>
@@ -7122,7 +4007,6 @@
                 <w:sz w:val="24"/>
                 <w:szCs w:val="24"/>
               </w:rPr>
-              <w:lastRenderedPageBreak/>
               <w:t>[8]</w:t>
             </w:r>
           </w:p>
@@ -7539,7 +4423,16 @@
                 <w:sz w:val="24"/>
                 <w:szCs w:val="24"/>
               </w:rPr>
-              <w:t>DA-MAPPO: Per-step Hungarian assignment + assignment-augmented observation vector + MAPPO + hierarchical 4-tier reward + curriculum training</w:t>
+              <w:t xml:space="preserve">DA-MAPPO: Per-step Hungarian assignment + assignment-augmented observation vector + MAPPO + hierarchical 4-tier </w:t>
+            </w:r>
+            <w:r>
+              <w:rPr>
+                <w:rFonts w:asciiTheme="majorBidi" w:hAnsiTheme="majorBidi" w:cstheme="majorBidi"/>
+                <w:sz w:val="24"/>
+                <w:szCs w:val="24"/>
+              </w:rPr>
+              <w:lastRenderedPageBreak/>
+              <w:t>reward + curriculum training</w:t>
             </w:r>
           </w:p>
         </w:tc>
@@ -7561,6 +4454,7 @@
                 <w:sz w:val="24"/>
                 <w:szCs w:val="24"/>
               </w:rPr>
+              <w:lastRenderedPageBreak/>
               <w:t>Custom sim; 3 UAVs; 3 dynamic targets; 30–50 static obstacles; 3 difficulty levels</w:t>
             </w:r>
           </w:p>
@@ -7799,16 +4693,7 @@
                 <w:sz w:val="24"/>
                 <w:szCs w:val="24"/>
               </w:rPr>
-              <w:t xml:space="preserve">Van Hasselt, H., Guez, A., </w:t>
-            </w:r>
-            <w:r>
-              <w:rPr>
-                <w:rFonts w:asciiTheme="majorBidi" w:hAnsiTheme="majorBidi" w:cstheme="majorBidi"/>
-                <w:sz w:val="24"/>
-                <w:szCs w:val="24"/>
-              </w:rPr>
-              <w:lastRenderedPageBreak/>
-              <w:t>&amp; Silver, D. (2016)</w:t>
+              <w:t>Van Hasselt, H., Guez, A., &amp; Silver, D. (2016)</w:t>
             </w:r>
           </w:p>
         </w:tc>
@@ -7830,17 +4715,7 @@
                 <w:sz w:val="24"/>
                 <w:szCs w:val="24"/>
               </w:rPr>
-              <w:lastRenderedPageBreak/>
-              <w:t xml:space="preserve">Double DQN: decouples action </w:t>
-            </w:r>
-            <w:r>
-              <w:rPr>
-                <w:rFonts w:asciiTheme="majorBidi" w:hAnsiTheme="majorBidi" w:cstheme="majorBidi"/>
-                <w:sz w:val="24"/>
-                <w:szCs w:val="24"/>
-              </w:rPr>
-              <w:lastRenderedPageBreak/>
-              <w:t>selection and action evaluation using online and target networks to reduce overestimation bias</w:t>
+              <w:t>Double DQN: decouples action selection and action evaluation using online and target networks to reduce overestimation bias</w:t>
             </w:r>
           </w:p>
         </w:tc>
@@ -7862,17 +4737,7 @@
                 <w:sz w:val="24"/>
                 <w:szCs w:val="24"/>
               </w:rPr>
-              <w:lastRenderedPageBreak/>
-              <w:t xml:space="preserve">Atari 2600 games (same </w:t>
-            </w:r>
-            <w:r>
-              <w:rPr>
-                <w:rFonts w:asciiTheme="majorBidi" w:hAnsiTheme="majorBidi" w:cstheme="majorBidi"/>
-                <w:sz w:val="24"/>
-                <w:szCs w:val="24"/>
-              </w:rPr>
-              <w:lastRenderedPageBreak/>
-              <w:t>benchmark as DQN)</w:t>
+              <w:t>Atari 2600 games (same benchmark as DQN)</w:t>
             </w:r>
           </w:p>
         </w:tc>
@@ -7894,17 +4759,7 @@
                 <w:sz w:val="24"/>
                 <w:szCs w:val="24"/>
               </w:rPr>
-              <w:lastRenderedPageBreak/>
-              <w:t xml:space="preserve">Reduces systematic Q-value </w:t>
-            </w:r>
-            <w:r>
-              <w:rPr>
-                <w:rFonts w:asciiTheme="majorBidi" w:hAnsiTheme="majorBidi" w:cstheme="majorBidi"/>
-                <w:sz w:val="24"/>
-                <w:szCs w:val="24"/>
-              </w:rPr>
-              <w:lastRenderedPageBreak/>
-              <w:t>overestimation; improves stability and final performance over DQN on most Atari games</w:t>
+              <w:t>Reduces systematic Q-value overestimation; improves stability and final performance over DQN on most Atari games</w:t>
             </w:r>
           </w:p>
         </w:tc>
@@ -7926,17 +4781,7 @@
                 <w:sz w:val="24"/>
                 <w:szCs w:val="24"/>
               </w:rPr>
-              <w:lastRenderedPageBreak/>
-              <w:t xml:space="preserve">Discrete action spaces only; does </w:t>
-            </w:r>
-            <w:r>
-              <w:rPr>
-                <w:rFonts w:asciiTheme="majorBidi" w:hAnsiTheme="majorBidi" w:cstheme="majorBidi"/>
-                <w:sz w:val="24"/>
-                <w:szCs w:val="24"/>
-              </w:rPr>
-              <w:lastRenderedPageBreak/>
-              <w:t>not address data efficiency or multi-step credit assignment</w:t>
+              <w:t>Discrete action spaces only; does not address data efficiency or multi-step credit assignment</w:t>
             </w:r>
           </w:p>
         </w:tc>
@@ -7962,7 +4807,6 @@
                 <w:sz w:val="24"/>
                 <w:szCs w:val="24"/>
               </w:rPr>
-              <w:lastRenderedPageBreak/>
               <w:t>[14]</w:t>
             </w:r>
           </w:p>
@@ -8411,7 +5255,16 @@
                 <w:sz w:val="24"/>
                 <w:szCs w:val="24"/>
               </w:rPr>
-              <w:t>On-policy and sample inefficient; clip parameter requires tuning; slower convergence than off-policy methods in complex settings</w:t>
+              <w:t xml:space="preserve">On-policy and sample inefficient; clip parameter requires tuning; slower convergence than off-policy </w:t>
+            </w:r>
+            <w:r>
+              <w:rPr>
+                <w:rFonts w:asciiTheme="majorBidi" w:hAnsiTheme="majorBidi" w:cstheme="majorBidi"/>
+                <w:sz w:val="24"/>
+                <w:szCs w:val="24"/>
+              </w:rPr>
+              <w:lastRenderedPageBreak/>
+              <w:t>methods in complex settings</w:t>
             </w:r>
           </w:p>
         </w:tc>
@@ -8437,6 +5290,7 @@
                 <w:sz w:val="24"/>
                 <w:szCs w:val="24"/>
               </w:rPr>
+              <w:lastRenderedPageBreak/>
               <w:t>[17]</w:t>
             </w:r>
           </w:p>
@@ -8617,16 +5471,7 @@
                 <w:sz w:val="24"/>
                 <w:szCs w:val="24"/>
               </w:rPr>
-              <w:t xml:space="preserve">TD3: Twin Delayed DDPG with clipped double Q-learning + delayed policy </w:t>
-            </w:r>
-            <w:r>
-              <w:rPr>
-                <w:rFonts w:asciiTheme="majorBidi" w:hAnsiTheme="majorBidi" w:cstheme="majorBidi"/>
-                <w:sz w:val="24"/>
-                <w:szCs w:val="24"/>
-              </w:rPr>
-              <w:lastRenderedPageBreak/>
-              <w:t>updates + target policy smoothing to reduce overestimation in actor-critic</w:t>
+              <w:t>TD3: Twin Delayed DDPG with clipped double Q-learning + delayed policy updates + target policy smoothing to reduce overestimation in actor-critic</w:t>
             </w:r>
           </w:p>
         </w:tc>
@@ -8649,7 +5494,6 @@
                 <w:sz w:val="24"/>
                 <w:szCs w:val="24"/>
               </w:rPr>
-              <w:lastRenderedPageBreak/>
               <w:t>MuJoCo</w:t>
             </w:r>
             <w:proofErr w:type="spellEnd"/>
@@ -8677,7 +5521,6 @@
                 <w:sz w:val="24"/>
                 <w:szCs w:val="24"/>
               </w:rPr>
-              <w:lastRenderedPageBreak/>
               <w:t>, Hopper, Walker2D, Ant)</w:t>
             </w:r>
           </w:p>
@@ -8700,17 +5543,7 @@
                 <w:sz w:val="24"/>
                 <w:szCs w:val="24"/>
               </w:rPr>
-              <w:lastRenderedPageBreak/>
-              <w:t>Reduces overestimation in actor-critic methods; more stable than DDPG; state-of-the-</w:t>
-            </w:r>
-            <w:r>
-              <w:rPr>
-                <w:rFonts w:asciiTheme="majorBidi" w:hAnsiTheme="majorBidi" w:cstheme="majorBidi"/>
-                <w:sz w:val="24"/>
-                <w:szCs w:val="24"/>
-              </w:rPr>
-              <w:lastRenderedPageBreak/>
-              <w:t>art on continuous control tasks</w:t>
+              <w:t>Reduces overestimation in actor-critic methods; more stable than DDPG; state-of-the-art on continuous control tasks</w:t>
             </w:r>
           </w:p>
         </w:tc>
@@ -8733,7 +5566,6 @@
                 <w:sz w:val="24"/>
                 <w:szCs w:val="24"/>
               </w:rPr>
-              <w:lastRenderedPageBreak/>
               <w:t>Off-policy</w:t>
             </w:r>
             <w:proofErr w:type="gramEnd"/>
@@ -8743,16 +5575,7 @@
                 <w:sz w:val="24"/>
                 <w:szCs w:val="24"/>
               </w:rPr>
-              <w:t xml:space="preserve">; requires large replay buffer; harder to extend to cooperative </w:t>
-            </w:r>
-            <w:r>
-              <w:rPr>
-                <w:rFonts w:asciiTheme="majorBidi" w:hAnsiTheme="majorBidi" w:cstheme="majorBidi"/>
-                <w:sz w:val="24"/>
-                <w:szCs w:val="24"/>
-              </w:rPr>
-              <w:lastRenderedPageBreak/>
-              <w:t>multi-agent settings directly</w:t>
+              <w:t>; requires large replay buffer; harder to extend to cooperative multi-agent settings directly</w:t>
             </w:r>
           </w:p>
         </w:tc>
@@ -8778,7 +5601,6 @@
                 <w:sz w:val="24"/>
                 <w:szCs w:val="24"/>
               </w:rPr>
-              <w:lastRenderedPageBreak/>
               <w:t>[19]</w:t>
             </w:r>
           </w:p>
@@ -9095,7 +5917,16 @@
                 <w:sz w:val="24"/>
                 <w:szCs w:val="24"/>
               </w:rPr>
-              <w:t>MAPPO: PPO adapted for cooperative MARL with shared centralized critic on global state; value normalization; clipped updates</w:t>
+              <w:t xml:space="preserve">MAPPO: PPO adapted for cooperative MARL with shared centralized critic on global state; value </w:t>
+            </w:r>
+            <w:r>
+              <w:rPr>
+                <w:rFonts w:asciiTheme="majorBidi" w:hAnsiTheme="majorBidi" w:cstheme="majorBidi"/>
+                <w:sz w:val="24"/>
+                <w:szCs w:val="24"/>
+              </w:rPr>
+              <w:lastRenderedPageBreak/>
+              <w:t>normalization; clipped updates</w:t>
             </w:r>
           </w:p>
         </w:tc>
@@ -9117,7 +5948,17 @@
                 <w:sz w:val="24"/>
                 <w:szCs w:val="24"/>
               </w:rPr>
-              <w:t>StarCraft Multi-Agent Challenge (SMAC); Multi-Agent Particle Environment (MPE)</w:t>
+              <w:lastRenderedPageBreak/>
+              <w:t xml:space="preserve">StarCraft Multi-Agent Challenge (SMAC); Multi-Agent Particle </w:t>
+            </w:r>
+            <w:r>
+              <w:rPr>
+                <w:rFonts w:asciiTheme="majorBidi" w:hAnsiTheme="majorBidi" w:cstheme="majorBidi"/>
+                <w:sz w:val="24"/>
+                <w:szCs w:val="24"/>
+              </w:rPr>
+              <w:lastRenderedPageBreak/>
+              <w:t>Environment (MPE)</w:t>
             </w:r>
           </w:p>
         </w:tc>
@@ -9139,7 +5980,17 @@
                 <w:sz w:val="24"/>
                 <w:szCs w:val="24"/>
               </w:rPr>
-              <w:t>Surprisingly competitive with QMIX despite simplicity; stable training; reproducible; adopted as standard MARL baseline in recent UAV work</w:t>
+              <w:lastRenderedPageBreak/>
+              <w:t xml:space="preserve">Surprisingly competitive with QMIX despite simplicity; stable training; reproducible; adopted as standard </w:t>
+            </w:r>
+            <w:r>
+              <w:rPr>
+                <w:rFonts w:asciiTheme="majorBidi" w:hAnsiTheme="majorBidi" w:cstheme="majorBidi"/>
+                <w:sz w:val="24"/>
+                <w:szCs w:val="24"/>
+              </w:rPr>
+              <w:lastRenderedPageBreak/>
+              <w:t>MARL baseline in recent UAV work</w:t>
             </w:r>
           </w:p>
         </w:tc>
@@ -9161,7 +6012,17 @@
                 <w:sz w:val="24"/>
                 <w:szCs w:val="24"/>
               </w:rPr>
-              <w:t>On-policy and sample inefficient; requires global state for critic during training; performance gap narrows with larger teams</w:t>
+              <w:lastRenderedPageBreak/>
+              <w:t xml:space="preserve">On-policy and sample inefficient; requires global state for critic during training; performance gap </w:t>
+            </w:r>
+            <w:r>
+              <w:rPr>
+                <w:rFonts w:asciiTheme="majorBidi" w:hAnsiTheme="majorBidi" w:cstheme="majorBidi"/>
+                <w:sz w:val="24"/>
+                <w:szCs w:val="24"/>
+              </w:rPr>
+              <w:lastRenderedPageBreak/>
+              <w:t>narrows with larger teams</w:t>
             </w:r>
           </w:p>
         </w:tc>
@@ -9187,6 +6048,7 @@
                 <w:sz w:val="24"/>
                 <w:szCs w:val="24"/>
               </w:rPr>
+              <w:lastRenderedPageBreak/>
               <w:t>[22]</w:t>
             </w:r>
           </w:p>
@@ -9313,17 +6175,6 @@
         </w:tc>
       </w:tr>
     </w:tbl>
-    <w:p>
-      <w:pPr>
-        <w:spacing w:after="160" w:line="360" w:lineRule="auto"/>
-        <w:jc w:val="both"/>
-        <w:rPr>
-          <w:rFonts w:asciiTheme="majorBidi" w:hAnsiTheme="majorBidi" w:cstheme="majorBidi"/>
-          <w:sz w:val="24"/>
-          <w:szCs w:val="24"/>
-        </w:rPr>
-      </w:pPr>
-    </w:p>
     <w:p>
       <w:pPr>
         <w:spacing w:after="160" w:line="360" w:lineRule="auto"/>
@@ -9357,7 +6208,6 @@
           <w:sz w:val="24"/>
           <w:szCs w:val="24"/>
         </w:rPr>
-        <w:lastRenderedPageBreak/>
         <w:t>Problem Statement</w:t>
       </w:r>
     </w:p>
@@ -9373,17 +6223,14 @@
         </w:rPr>
       </w:pPr>
       <w:r>
-        <w:rPr>
-          <w:b w:val="0"/>
-        </w:rPr>
-        <w:t>In cooperative multi-UAV missions, target assignment and collision avoidance are structurally coupled rather than independent decisions: the route each drone takes toward its designated target directly determines how close it comes to other agents and obstacles, and any course correction made to avoid a collision changes which assignment that drone can realistically still complete. This coupling propagates through the swarm. When a single drone executes an evasive maneuver, its original high-priority target may go unattended; neighboring drones face immediate reassignment conflicts; and the trajectories they adjust in response introduce new inter-agent proximity risks — a chain in which one local deviation escalates into a mission-level coordination failure. The problem intensifies when target priorities shift mid-mission: a drone simultaneously committed to a prior assignment, displaced from the position optimal for a new one, and on a collision course with another agent faces two contradictions at once, with no mechanism in place to resolve them within a single coordinated decision. Without explicitly accounting for how task allocation shapes each drone's spatial behavior and how safety-driven deviations feed back into task feasibility, multi-UAV systems cannot reliably maintain both high-value target coverage and collision-free operation under dynamic conditions. Existing frameworks address only one side of this coupling: DA-MAPPO treats collision avoidance as a static penalty term, leaving conflict-driven course corrections invisible to its assignment logic, while IGAT-MARL assumes fixed targets, making the assignment consequences of any avoidance maneuver unrepresentable in the policy. The result is a fundamental unresolved tension: no existing framework provides a joint representation in which both assignment state and conflict neighborhood are simultaneously visible to a single shared policy, and whether a unified architecture can hold both objectives in balance — or whether one systematically undermines the other — has not been established in three-dimensional multi-UAV environments. The proposed coordinated mechanism is a Priority Arbitration Head: a small neural network jointly trained with the MAPPO actor that takes time-to-collision, distance to the assigned target, and conflict neighborhood count as inputs and outputs a dynamic weight α ∈ [0,1] at each decision step, applied as: r_total = α × r_assignment + (1−α) × r_avoidance. Unlike the fixed reward coefficients used in DA-MAPPO and the fixed penalty constants used in IGAT-MARL, the arbitration head learns when evasion must override assignment and when assignment can safely dominate, providing within a single coordinated decision the mechanism that neither existing framework supplies.</w:t>
+        <w:t>In multi-UAV cooperative missions, task allocation and collision avoidance are interdependent a UAV's path to its assigned target determines proximity to other UAVs, while any safety-driven deviation alters its ability to reach that target. This coupling creates cascading failures: one avoidance correction can leave a high-priority target uncovered, trigger swarm-wide reassignment conflicts, and generate new collision risks simultaneously. When target priorities shift mid-mission, no unified mechanism exists to resolve positional infeasibility and collision risk at once, making mission-wide failure inevitable. Systems that treat these as separate problems therefore cannot guarantee target coverage and collision-free operation under dynamic conditions</w:t>
       </w:r>
       <w:r>
         <w:rPr>
           <w:rFonts w:ascii="Times New Roman" w:hAnsi="Times New Roman"/>
-          <w:b w:val="0"/>
-          <w:sz w:val="24"/>
-        </w:rPr>
+          <w:sz w:val="24"/>
+        </w:rPr>
+        <w:t>.</w:t>
       </w:r>
     </w:p>
     <w:p>
@@ -9429,11 +6276,12 @@
       </w:pPr>
       <w:r>
         <w:rPr>
+          <w:rFonts w:asciiTheme="majorBidi" w:hAnsiTheme="majorBidi" w:cstheme="majorBidi"/>
           <w:bCs/>
           <w:sz w:val="24"/>
           <w:szCs w:val="24"/>
         </w:rPr>
-        <w:t>To design and implement a Priority Arbitration Head — a lightweight feedforward module jointly trained with the MAPPO actor — that dynamically weights assignment and avoidance objectives at each decision step using time-to-collision, distance to the assigned target, and conflict neighborhood count as inputs, integrated within a unified observation framework that encodes both Hungarian-algorithm-based target assignment and conflict-graph-aware neighborhood for each drone in a three-dimensional environment.</w:t>
+        <w:t xml:space="preserve">To design an integrated representation of the observation that encodes both the assignment (based on Hungarian algorithm) and the current conflict-aware neighborhood for each </w:t>
       </w:r>
       <w:proofErr w:type="spellStart"/>
       <w:r>
@@ -9443,6 +6291,7 @@
           <w:sz w:val="24"/>
           <w:szCs w:val="24"/>
         </w:rPr>
+        <w:t>drone</w:t>
       </w:r>
       <w:proofErr w:type="spellEnd"/>
       <w:r>
@@ -9452,6 +6301,7 @@
           <w:sz w:val="24"/>
           <w:szCs w:val="24"/>
         </w:rPr>
+        <w:t xml:space="preserve"> in a 3D MAPPO policy.</w:t>
       </w:r>
     </w:p>
     <w:p>
@@ -9498,11 +6348,12 @@
       </w:pPr>
       <w:r>
         <w:rPr>
+          <w:rFonts w:asciiTheme="majorBidi" w:hAnsiTheme="majorBidi" w:cstheme="majorBidi"/>
           <w:bCs/>
           <w:sz w:val="24"/>
           <w:szCs w:val="24"/>
         </w:rPr>
-        <w:t>To perform controlled ablation experiments that isolate the contribution of each framework component — the conflict graph, the Hungarian assignment mechanism, the 3D environment extension, and the Priority Arbitration Head — with explicit comparison between the learned arbitration weight α and fixed-coefficient baselines at α = 0.3, 0.5, and 0.7, in order to determine whether a learned weighting mechanism outperforms fixed reward coefficients in maintaining both high mission success and low collision incidence under dynamic three-dimensional conditions.</w:t>
+        <w:t>To perform controlled ablation experiments, isolating the contribution of the conflict graph, the assignment mechanism, and the 3D extension, whether each of them increases or decreases the number of assignments, and whether they increase or decrease more together.</w:t>
       </w:r>
     </w:p>
     <w:p>
@@ -9528,6 +6379,7 @@
           <w:sz w:val="24"/>
           <w:szCs w:val="24"/>
         </w:rPr>
+        <w:lastRenderedPageBreak/>
         <w:t xml:space="preserve">To find the failure boundary: the space where the swarm size, obstacle density, and speed of the target are, when combined with the policy, sufficient to cause failure, and to </w:t>
       </w:r>
       <w:r>
@@ -9604,16 +6456,7 @@
           <w:sz w:val="24"/>
           <w:szCs w:val="24"/>
         </w:rPr>
-        <w:t xml:space="preserve">The proposed research is of quantitative, experimental type with the application of multi-agent deep reinforcement learning, in a controlled 3D simulation environment. The framework is based on MAPPO (Multi-Agent Proximal Policy Optimization), </w:t>
-      </w:r>
-      <w:r>
-        <w:rPr>
-          <w:rFonts w:asciiTheme="majorBidi" w:hAnsiTheme="majorBidi" w:cstheme="majorBidi"/>
-          <w:sz w:val="24"/>
-          <w:szCs w:val="24"/>
-        </w:rPr>
-        <w:lastRenderedPageBreak/>
-        <w:t xml:space="preserve">which was chosen for having been proven to perform well in the target assignment scenario by DA-MAPPO </w:t>
+        <w:t xml:space="preserve">The proposed research is of quantitative, experimental type with the application of multi-agent deep reinforcement learning, in a controlled 3D simulation environment. The framework is based on MAPPO (Multi-Agent Proximal Policy Optimization), which was chosen for having been proven to perform well in the target assignment scenario by DA-MAPPO </w:t>
       </w:r>
       <w:r>
         <w:rPr>
@@ -9670,10 +6513,11 @@
       </w:pPr>
       <w:r>
         <w:rPr>
-          <w:sz w:val="24"/>
-          <w:szCs w:val="24"/>
-        </w:rPr>
-        <w:t>The observation vector for each drone includes four elements: (1) the 3D position and velocity of the drone; (2) the 3D relative position of the drone's current target, as computed from a minimum-cost Hungarian assignment performed over all drones at each decision step; (3) the positions and velocities of the drone's current conflict neighbors only; these neighbors are determined by a dynamic conflict graph established at each decision step, which connects sets of drone pairs expected to come within a certain time horizon of a danger threshold; and (4) obstacle proximity readings in six cardinal directions. Actions are 3D velocity instructions that are executed continuously over time, trained against a common MAPPO actor-critic network and centralized critic, and executed by a decentralized MAPPO actor network. The Priority Arbitration Head — a two-layer feedforward network with 64 neurons, jointly trained with the MAPPO actor through the same policy gradient update — takes three scalar inputs at each decision step: time-to-collision (τ_collision), distance to the assigned target (d_target), and the count of drones in the conflict neighborhood (n_conflict). It outputs a single dynamic weight α ∈ [0,1] applied as: r_total = α × r_assignment + (1−α) × r_avoidance. The arbitration head adds no parameters to the centralized critic and requires no separate training loop; its weights are updated jointly with the MAPPO actor at each gradient step. This design makes the Priority Arbitration Head the first learned mechanism in the multi-UAV coordination literature to resolve the assignment–avoidance trade-off dynamically at each decision step, replacing the fixed hand-tuned reward coefficients used in all existing frameworks.</w:t>
+          <w:rFonts w:asciiTheme="majorBidi" w:hAnsiTheme="majorBidi" w:cstheme="majorBidi"/>
+          <w:sz w:val="24"/>
+          <w:szCs w:val="24"/>
+        </w:rPr>
+        <w:t>The observation vector for each drone includes four elements: (1) the 3D position and velocity of the drone; (2) the 3D relative position of the drone's current target, as computed from a minimum-cost Hungarian assignment performed over all drones at each decision step; (3) the positions and velocities of the drone's current conflict neighbors only; these neighbors are determined by a dynamic conflict graph established at each decision step, which connects sets of drone pairs expected to come within a certain time horizon of a danger threshold; and (4) obstacle proximity readings in six cardinal directions. Actions are 3D velocity instructions that are executed continuously over time, trained against a common MAPPO actor-critic network and centralized critic, and executed by a decentralized MAPPO actor network.</w:t>
       </w:r>
     </w:p>
     <w:p>
@@ -9846,6 +6690,7 @@
           <w:sz w:val="24"/>
           <w:szCs w:val="24"/>
         </w:rPr>
+        <w:lastRenderedPageBreak/>
         <w:t>Stage 4</w:t>
       </w:r>
       <w:r>
@@ -9923,16 +6768,7 @@
           <w:sz w:val="24"/>
           <w:szCs w:val="24"/>
         </w:rPr>
-        <w:t xml:space="preserve"> reach their assigned targets without having any drone and obstacle collisions or inter-drone collisions within a pre-defined time limit. Secondary metrics include inter-drone collision count, obstacle collision count, </w:t>
-      </w:r>
-      <w:r>
-        <w:rPr>
-          <w:rFonts w:asciiTheme="majorBidi" w:hAnsiTheme="majorBidi" w:cstheme="majorBidi"/>
-          <w:sz w:val="24"/>
-          <w:szCs w:val="24"/>
-        </w:rPr>
-        <w:lastRenderedPageBreak/>
-        <w:t xml:space="preserve">number of target reassignments per episode and average trajectory length per drone. The system will be tested with three different obstacle densities (30, 40 and 50 obstacles), and three different swarm sizes (3, 5 and 8 drones), as specified in the difficulty configurations of DA-MAPPO. Four baselines are implemented: standard MAPPO (without assignment and conflict graph); DA-MAPPO ported to 3D without using a conflict graph; IGAT-MARL with a fixed assignment; and original 2D DA-MAPPO for replication verification. The experiments are conducted on </w:t>
+        <w:t xml:space="preserve"> reach their assigned targets without having any drone and obstacle collisions or inter-drone collisions within a pre-defined time limit. Secondary metrics include inter-drone collision count, obstacle collision count, number of target reassignments per episode and average trajectory length per drone. The system will be tested with three different obstacle densities (30, 40 and 50 obstacles), and three different swarm sizes (3, 5 and 8 drones), as specified in the difficulty configurations of DA-MAPPO. Four baselines are implemented: standard MAPPO (without assignment and conflict graph); DA-MAPPO ported to 3D without using a conflict graph; IGAT-MARL with a fixed assignment; and original 2D DA-MAPPO for replication verification. The experiments are conducted on </w:t>
       </w:r>
       <w:proofErr w:type="spellStart"/>
       <w:r>
@@ -9983,55 +6819,14 @@
       </w:pPr>
       <w:r>
         <w:rPr>
+          <w:rFonts w:asciiTheme="majorBidi" w:hAnsiTheme="majorBidi" w:cstheme="majorBidi"/>
           <w:b/>
           <w:bCs/>
           <w:sz w:val="24"/>
           <w:szCs w:val="24"/>
         </w:rPr>
+        <w:lastRenderedPageBreak/>
         <w:t>Framework Pipeline:</w:t>
-        <w:br/>
-        <w:br/>
-        <w:t>Step 1 — Observation Building (per drone, per timestep):</w:t>
-        <w:br/>
-        <w:t xml:space="preserve">  (a) Self-state: 3D position and velocity</w:t>
-        <w:br/>
-        <w:t xml:space="preserve">  (b) Assignment state: relative position of assigned target [via minimum-cost Hungarian allocation over all drones]</w:t>
-        <w:br/>
-        <w:t xml:space="preserve">  (c) Conflict neighborhood: positions and velocities of drones predicted to come within collision threshold [via dynamic conflict graph]</w:t>
-        <w:br/>
-        <w:t xml:space="preserve">  (d) Obstacle proximity: distance readings in 6 cardinal directions</w:t>
-        <w:br/>
-        <w:br/>
-        <w:t>Step 2 — Parallel Processing of Joint Observation:</w:t>
-        <w:br/>
-        <w:t xml:space="preserve">  (a) MAPPO Decentralized Actor → 3D velocity action</w:t>
-        <w:br/>
-        <w:t xml:space="preserve">  (b) Priority Arbitration Head → dynamic weight α ∈ [0,1]</w:t>
-        <w:br/>
-        <w:t xml:space="preserve">       · Input: τ_collision (time-to-collision), d_target (distance to assigned target), n_conflict (conflict neighbor count)</w:t>
-        <w:br/>
-        <w:t xml:space="preserve">       · Output: α (close to 1 = assignment dominant; close to 0 = avoidance dominant)</w:t>
-        <w:br/>
-        <w:br/>
-        <w:t>Step 3 — Reward Computation:</w:t>
-        <w:br/>
-        <w:t xml:space="preserve">  r_total = α × r_assignment + (1−α) × r_avoidance</w:t>
-        <w:br/>
-        <w:t xml:space="preserve">  [α is state-conditioned and learned — not a fixed constant]</w:t>
-        <w:br/>
-        <w:br/>
-        <w:t>Step 4 — Environment Execution:</w:t>
-        <w:br/>
-        <w:t xml:space="preserve">  3D velocity command applied → new state observed → next timestep begins</w:t>
-        <w:br/>
-        <w:br/>
-        <w:t>Step 5 — Centralized Training (MAPPO):</w:t>
-        <w:br/>
-        <w:t xml:space="preserve">  Centralized Critic receives full joint state of all drones</w:t>
-        <w:br/>
-        <w:t xml:space="preserve">  Policy gradient update trains BOTH the MAPPO Actor AND the Priority Arbitration Head jointly</w:t>
-        <w:br/>
-        <w:t xml:space="preserve">  Decentralized execution: each drone uses only its own observation at deployment</w:t>
       </w:r>
       <w:r>
         <w:rPr>
@@ -10041,6 +6836,7 @@
           <w:sz w:val="24"/>
           <w:szCs w:val="24"/>
         </w:rPr>
+        <w:br/>
       </w:r>
       <w:r>
         <w:rPr>
@@ -10048,6 +6844,7 @@
           <w:sz w:val="24"/>
           <w:szCs w:val="24"/>
         </w:rPr>
+        <w:br/>
       </w:r>
       <w:r>
         <w:rPr>
@@ -10056,6 +6853,41 @@
           <w:sz w:val="24"/>
           <w:szCs w:val="24"/>
         </w:rPr>
+        <w:drawing>
+          <wp:inline distT="0" distB="0" distL="0" distR="0" wp14:anchorId="1F9EF093" wp14:editId="5F6D6547">
+            <wp:extent cx="3804745" cy="4896512"/>
+            <wp:effectExtent l="0" t="0" r="5715" b="5715"/>
+            <wp:docPr id="2070379057" name="Picture 1"/>
+            <wp:cNvGraphicFramePr>
+              <a:graphicFrameLocks xmlns:a="http://schemas.openxmlformats.org/drawingml/2006/main" noChangeAspect="1"/>
+            </wp:cNvGraphicFramePr>
+            <a:graphic xmlns:a="http://schemas.openxmlformats.org/drawingml/2006/main">
+              <a:graphicData uri="http://schemas.openxmlformats.org/drawingml/2006/picture">
+                <pic:pic xmlns:pic="http://schemas.openxmlformats.org/drawingml/2006/picture">
+                  <pic:nvPicPr>
+                    <pic:cNvPr id="2070379057" name="Picture 2070379057"/>
+                    <pic:cNvPicPr/>
+                  </pic:nvPicPr>
+                  <pic:blipFill>
+                    <a:blip r:embed="rId10"/>
+                    <a:stretch>
+                      <a:fillRect/>
+                    </a:stretch>
+                  </pic:blipFill>
+                  <pic:spPr>
+                    <a:xfrm>
+                      <a:off x="0" y="0"/>
+                      <a:ext cx="3804745" cy="4896512"/>
+                    </a:xfrm>
+                    <a:prstGeom prst="rect">
+                      <a:avLst/>
+                    </a:prstGeom>
+                  </pic:spPr>
+                </pic:pic>
+              </a:graphicData>
+            </a:graphic>
+          </wp:inline>
+        </w:drawing>
       </w:r>
     </w:p>
     <w:p>
@@ -10099,7 +6931,6 @@
           <w:sz w:val="24"/>
           <w:szCs w:val="24"/>
         </w:rPr>
-        <w:lastRenderedPageBreak/>
         <w:t>References</w:t>
       </w:r>
     </w:p>
@@ -10178,6 +7009,7 @@
           <w:sz w:val="24"/>
           <w:szCs w:val="24"/>
         </w:rPr>
+        <w:lastRenderedPageBreak/>
         <w:t xml:space="preserve">[3] R. </w:t>
       </w:r>
       <w:proofErr w:type="spellStart"/>
@@ -10500,7 +7332,6 @@
           <w:sz w:val="24"/>
           <w:szCs w:val="24"/>
         </w:rPr>
-        <w:lastRenderedPageBreak/>
         <w:t xml:space="preserve">[12] V. </w:t>
       </w:r>
       <w:proofErr w:type="spellStart"/>
@@ -10579,6 +7410,7 @@
           <w:sz w:val="24"/>
           <w:szCs w:val="24"/>
         </w:rPr>
+        <w:lastRenderedPageBreak/>
         <w:t>[15] T. Schaul, J. Quan, I. Antonoglou, and D. Silver, "Prioritized experience replay," in Proc. ICLR, 2016.</w:t>
       </w:r>
     </w:p>
@@ -10907,6 +7739,78 @@
         </w:rPr>
         <w:t>. Intell. Rev., vol. 55, pp. 895–943, 2022.</w:t>
       </w:r>
+    </w:p>
+    <w:p>
+      <w:pPr>
+        <w:spacing w:after="80" w:line="360" w:lineRule="auto"/>
+        <w:ind w:left="432" w:hanging="432"/>
+        <w:jc w:val="both"/>
+        <w:rPr>
+          <w:rFonts w:asciiTheme="majorBidi" w:hAnsiTheme="majorBidi" w:cstheme="majorBidi"/>
+          <w:sz w:val="24"/>
+          <w:szCs w:val="24"/>
+        </w:rPr>
+      </w:pPr>
+    </w:p>
+    <w:p>
+      <w:pPr>
+        <w:spacing w:after="80" w:line="360" w:lineRule="auto"/>
+        <w:ind w:left="432" w:hanging="432"/>
+        <w:jc w:val="both"/>
+        <w:rPr>
+          <w:rFonts w:asciiTheme="majorBidi" w:hAnsiTheme="majorBidi" w:cstheme="majorBidi"/>
+          <w:sz w:val="24"/>
+          <w:szCs w:val="24"/>
+        </w:rPr>
+      </w:pPr>
+    </w:p>
+    <w:p>
+      <w:pPr>
+        <w:spacing w:after="80" w:line="360" w:lineRule="auto"/>
+        <w:ind w:left="432" w:hanging="432"/>
+        <w:jc w:val="both"/>
+        <w:rPr>
+          <w:rFonts w:asciiTheme="majorBidi" w:hAnsiTheme="majorBidi" w:cstheme="majorBidi"/>
+          <w:sz w:val="24"/>
+          <w:szCs w:val="24"/>
+        </w:rPr>
+      </w:pPr>
+    </w:p>
+    <w:p>
+      <w:pPr>
+        <w:spacing w:after="80" w:line="360" w:lineRule="auto"/>
+        <w:ind w:left="432" w:hanging="432"/>
+        <w:jc w:val="both"/>
+        <w:rPr>
+          <w:rFonts w:asciiTheme="majorBidi" w:hAnsiTheme="majorBidi" w:cstheme="majorBidi"/>
+          <w:sz w:val="24"/>
+          <w:szCs w:val="24"/>
+        </w:rPr>
+      </w:pPr>
+    </w:p>
+    <w:p>
+      <w:pPr>
+        <w:spacing w:after="80" w:line="360" w:lineRule="auto"/>
+        <w:ind w:left="432" w:hanging="432"/>
+        <w:jc w:val="both"/>
+        <w:rPr>
+          <w:rFonts w:asciiTheme="majorBidi" w:hAnsiTheme="majorBidi" w:cstheme="majorBidi"/>
+          <w:sz w:val="24"/>
+          <w:szCs w:val="24"/>
+        </w:rPr>
+      </w:pPr>
+    </w:p>
+    <w:p>
+      <w:pPr>
+        <w:spacing w:after="80" w:line="360" w:lineRule="auto"/>
+        <w:ind w:left="432" w:hanging="432"/>
+        <w:jc w:val="both"/>
+        <w:rPr>
+          <w:rFonts w:asciiTheme="majorBidi" w:hAnsiTheme="majorBidi" w:cstheme="majorBidi"/>
+          <w:sz w:val="24"/>
+          <w:szCs w:val="24"/>
+        </w:rPr>
+      </w:pPr>
     </w:p>
     <w:p>
       <w:pPr>
@@ -13118,6 +10022,7 @@
       </w:pPr>
     </w:p>
     <w:sectPr>
+      <w:footerReference w:type="default" r:id="rId11"/>
       <w:type w:val="continuous"/>
       <w:pgSz w:w="11906" w:h="16838"/>
       <w:pgMar w:top="1440" w:right="1440" w:bottom="1440" w:left="1440" w:header="720" w:footer="720" w:gutter="0"/>

</xml_diff>